<commit_message>
docs: record code hosting as provided (A7)
Co-Authored-By: Claude Opus 5.5 <noreply@anthropic.com>
Claude-Session: https://claude.ai/code/session_01KxscWn9fSBZzY3BEJFGfy4
</commit_message>
<xml_diff>
--- a/docs/sachin-to-provide.docx
+++ b/docs/sachin-to-provide.docx
@@ -1793,7 +1793,7 @@
                 <w:sz w:val="20"/>
                 <w:szCs w:val="20"/>
               </w:rPr>
-              <w:t xml:space="preserve">Open</w:t>
+              <w:t xml:space="preserve">Done</w:t>
             </w:r>
           </w:p>
         </w:tc>
@@ -13853,9 +13853,9 @@
         </w:tblBorders>
       </w:tblPr>
       <w:tblGrid>
-        <w:gridCol w:w="2905"/>
-        <w:gridCol w:w="4500"/>
-        <w:gridCol w:w="1955"/>
+        <w:gridCol w:w="2619"/>
+        <w:gridCol w:w="4944"/>
+        <w:gridCol w:w="1797"/>
       </w:tblGrid>
       <w:tr>
         <w:trPr>
@@ -13864,7 +13864,7 @@
         </w:trPr>
         <w:tc>
           <w:tcPr>
-            <w:tcW w:type="dxa" w:w="2905"/>
+            <w:tcW w:type="dxa" w:w="2619"/>
             <w:tcBorders>
               <w:top w:val="single" w:color="BFBFBF" w:sz="4"/>
               <w:left w:val="single" w:color="BFBFBF" w:sz="4"/>
@@ -13893,7 +13893,7 @@
         </w:tc>
         <w:tc>
           <w:tcPr>
-            <w:tcW w:type="dxa" w:w="4500"/>
+            <w:tcW w:type="dxa" w:w="4944"/>
             <w:tcBorders>
               <w:top w:val="single" w:color="BFBFBF" w:sz="4"/>
               <w:left w:val="single" w:color="BFBFBF" w:sz="4"/>
@@ -13922,7 +13922,7 @@
         </w:tc>
         <w:tc>
           <w:tcPr>
-            <w:tcW w:type="dxa" w:w="1955"/>
+            <w:tcW w:type="dxa" w:w="1797"/>
             <w:tcBorders>
               <w:top w:val="single" w:color="BFBFBF" w:sz="4"/>
               <w:left w:val="single" w:color="BFBFBF" w:sz="4"/>
@@ -13957,7 +13957,7 @@
         </w:trPr>
         <w:tc>
           <w:tcPr>
-            <w:tcW w:type="dxa" w:w="2905"/>
+            <w:tcW w:type="dxa" w:w="2619"/>
             <w:tcBorders>
               <w:top w:val="single" w:color="BFBFBF" w:sz="4"/>
               <w:left w:val="single" w:color="BFBFBF" w:sz="4"/>
@@ -13983,7 +13983,7 @@
         </w:tc>
         <w:tc>
           <w:tcPr>
-            <w:tcW w:type="dxa" w:w="4500"/>
+            <w:tcW w:type="dxa" w:w="4944"/>
             <w:tcBorders>
               <w:top w:val="single" w:color="BFBFBF" w:sz="4"/>
               <w:left w:val="single" w:color="BFBFBF" w:sz="4"/>
@@ -14009,7 +14009,7 @@
         </w:tc>
         <w:tc>
           <w:tcPr>
-            <w:tcW w:type="dxa" w:w="1955"/>
+            <w:tcW w:type="dxa" w:w="1797"/>
             <w:tcBorders>
               <w:top w:val="single" w:color="BFBFBF" w:sz="4"/>
               <w:left w:val="single" w:color="BFBFBF" w:sz="4"/>
@@ -14041,7 +14041,7 @@
         </w:trPr>
         <w:tc>
           <w:tcPr>
-            <w:tcW w:type="dxa" w:w="2905"/>
+            <w:tcW w:type="dxa" w:w="2619"/>
             <w:tcBorders>
               <w:top w:val="single" w:color="BFBFBF" w:sz="4"/>
               <w:left w:val="single" w:color="BFBFBF" w:sz="4"/>
@@ -14067,7 +14067,7 @@
         </w:tc>
         <w:tc>
           <w:tcPr>
-            <w:tcW w:type="dxa" w:w="4500"/>
+            <w:tcW w:type="dxa" w:w="4944"/>
             <w:tcBorders>
               <w:top w:val="single" w:color="BFBFBF" w:sz="4"/>
               <w:left w:val="single" w:color="BFBFBF" w:sz="4"/>
@@ -14093,7 +14093,7 @@
         </w:tc>
         <w:tc>
           <w:tcPr>
-            <w:tcW w:type="dxa" w:w="1955"/>
+            <w:tcW w:type="dxa" w:w="1797"/>
             <w:tcBorders>
               <w:top w:val="single" w:color="BFBFBF" w:sz="4"/>
               <w:left w:val="single" w:color="BFBFBF" w:sz="4"/>
@@ -14125,7 +14125,7 @@
         </w:trPr>
         <w:tc>
           <w:tcPr>
-            <w:tcW w:type="dxa" w:w="2905"/>
+            <w:tcW w:type="dxa" w:w="2619"/>
             <w:tcBorders>
               <w:top w:val="single" w:color="BFBFBF" w:sz="4"/>
               <w:left w:val="single" w:color="BFBFBF" w:sz="4"/>
@@ -14151,7 +14151,7 @@
         </w:tc>
         <w:tc>
           <w:tcPr>
-            <w:tcW w:type="dxa" w:w="4500"/>
+            <w:tcW w:type="dxa" w:w="4944"/>
             <w:tcBorders>
               <w:top w:val="single" w:color="BFBFBF" w:sz="4"/>
               <w:left w:val="single" w:color="BFBFBF" w:sz="4"/>
@@ -14177,7 +14177,7 @@
         </w:tc>
         <w:tc>
           <w:tcPr>
-            <w:tcW w:type="dxa" w:w="1955"/>
+            <w:tcW w:type="dxa" w:w="1797"/>
             <w:tcBorders>
               <w:top w:val="single" w:color="BFBFBF" w:sz="4"/>
               <w:left w:val="single" w:color="BFBFBF" w:sz="4"/>
@@ -14209,7 +14209,7 @@
         </w:trPr>
         <w:tc>
           <w:tcPr>
-            <w:tcW w:type="dxa" w:w="2905"/>
+            <w:tcW w:type="dxa" w:w="2619"/>
             <w:tcBorders>
               <w:top w:val="single" w:color="BFBFBF" w:sz="4"/>
               <w:left w:val="single" w:color="BFBFBF" w:sz="4"/>
@@ -14235,7 +14235,7 @@
         </w:tc>
         <w:tc>
           <w:tcPr>
-            <w:tcW w:type="dxa" w:w="4500"/>
+            <w:tcW w:type="dxa" w:w="4944"/>
             <w:tcBorders>
               <w:top w:val="single" w:color="BFBFBF" w:sz="4"/>
               <w:left w:val="single" w:color="BFBFBF" w:sz="4"/>
@@ -14261,7 +14261,7 @@
         </w:tc>
         <w:tc>
           <w:tcPr>
-            <w:tcW w:type="dxa" w:w="1955"/>
+            <w:tcW w:type="dxa" w:w="1797"/>
             <w:tcBorders>
               <w:top w:val="single" w:color="BFBFBF" w:sz="4"/>
               <w:left w:val="single" w:color="BFBFBF" w:sz="4"/>
@@ -14293,7 +14293,7 @@
         </w:trPr>
         <w:tc>
           <w:tcPr>
-            <w:tcW w:type="dxa" w:w="2905"/>
+            <w:tcW w:type="dxa" w:w="2619"/>
             <w:tcBorders>
               <w:top w:val="single" w:color="BFBFBF" w:sz="4"/>
               <w:left w:val="single" w:color="BFBFBF" w:sz="4"/>
@@ -14319,7 +14319,7 @@
         </w:tc>
         <w:tc>
           <w:tcPr>
-            <w:tcW w:type="dxa" w:w="4500"/>
+            <w:tcW w:type="dxa" w:w="4944"/>
             <w:tcBorders>
               <w:top w:val="single" w:color="BFBFBF" w:sz="4"/>
               <w:left w:val="single" w:color="BFBFBF" w:sz="4"/>
@@ -14345,7 +14345,7 @@
         </w:tc>
         <w:tc>
           <w:tcPr>
-            <w:tcW w:type="dxa" w:w="1955"/>
+            <w:tcW w:type="dxa" w:w="1797"/>
             <w:tcBorders>
               <w:top w:val="single" w:color="BFBFBF" w:sz="4"/>
               <w:left w:val="single" w:color="BFBFBF" w:sz="4"/>
@@ -14377,7 +14377,7 @@
         </w:trPr>
         <w:tc>
           <w:tcPr>
-            <w:tcW w:type="dxa" w:w="2905"/>
+            <w:tcW w:type="dxa" w:w="2619"/>
             <w:tcBorders>
               <w:top w:val="single" w:color="BFBFBF" w:sz="4"/>
               <w:left w:val="single" w:color="BFBFBF" w:sz="4"/>
@@ -14403,7 +14403,7 @@
         </w:tc>
         <w:tc>
           <w:tcPr>
-            <w:tcW w:type="dxa" w:w="4500"/>
+            <w:tcW w:type="dxa" w:w="4944"/>
             <w:tcBorders>
               <w:top w:val="single" w:color="BFBFBF" w:sz="4"/>
               <w:left w:val="single" w:color="BFBFBF" w:sz="4"/>
@@ -14429,7 +14429,7 @@
         </w:tc>
         <w:tc>
           <w:tcPr>
-            <w:tcW w:type="dxa" w:w="1955"/>
+            <w:tcW w:type="dxa" w:w="1797"/>
             <w:tcBorders>
               <w:top w:val="single" w:color="BFBFBF" w:sz="4"/>
               <w:left w:val="single" w:color="BFBFBF" w:sz="4"/>
@@ -14461,7 +14461,7 @@
         </w:trPr>
         <w:tc>
           <w:tcPr>
-            <w:tcW w:type="dxa" w:w="2905"/>
+            <w:tcW w:type="dxa" w:w="2619"/>
             <w:tcBorders>
               <w:top w:val="single" w:color="BFBFBF" w:sz="4"/>
               <w:left w:val="single" w:color="BFBFBF" w:sz="4"/>
@@ -14487,7 +14487,7 @@
         </w:tc>
         <w:tc>
           <w:tcPr>
-            <w:tcW w:type="dxa" w:w="4500"/>
+            <w:tcW w:type="dxa" w:w="4944"/>
             <w:tcBorders>
               <w:top w:val="single" w:color="BFBFBF" w:sz="4"/>
               <w:left w:val="single" w:color="BFBFBF" w:sz="4"/>
@@ -14513,7 +14513,7 @@
         </w:tc>
         <w:tc>
           <w:tcPr>
-            <w:tcW w:type="dxa" w:w="1955"/>
+            <w:tcW w:type="dxa" w:w="1797"/>
             <w:tcBorders>
               <w:top w:val="single" w:color="BFBFBF" w:sz="4"/>
               <w:left w:val="single" w:color="BFBFBF" w:sz="4"/>
@@ -14545,7 +14545,7 @@
         </w:trPr>
         <w:tc>
           <w:tcPr>
-            <w:tcW w:type="dxa" w:w="2905"/>
+            <w:tcW w:type="dxa" w:w="2619"/>
             <w:tcBorders>
               <w:top w:val="single" w:color="BFBFBF" w:sz="4"/>
               <w:left w:val="single" w:color="BFBFBF" w:sz="4"/>
@@ -14571,7 +14571,7 @@
         </w:tc>
         <w:tc>
           <w:tcPr>
-            <w:tcW w:type="dxa" w:w="4500"/>
+            <w:tcW w:type="dxa" w:w="4944"/>
             <w:tcBorders>
               <w:top w:val="single" w:color="BFBFBF" w:sz="4"/>
               <w:left w:val="single" w:color="BFBFBF" w:sz="4"/>
@@ -14597,7 +14597,7 @@
         </w:tc>
         <w:tc>
           <w:tcPr>
-            <w:tcW w:type="dxa" w:w="1955"/>
+            <w:tcW w:type="dxa" w:w="1797"/>
             <w:tcBorders>
               <w:top w:val="single" w:color="BFBFBF" w:sz="4"/>
               <w:left w:val="single" w:color="BFBFBF" w:sz="4"/>
@@ -14629,7 +14629,7 @@
         </w:trPr>
         <w:tc>
           <w:tcPr>
-            <w:tcW w:type="dxa" w:w="2905"/>
+            <w:tcW w:type="dxa" w:w="2619"/>
             <w:tcBorders>
               <w:top w:val="single" w:color="BFBFBF" w:sz="4"/>
               <w:left w:val="single" w:color="BFBFBF" w:sz="4"/>
@@ -14655,7 +14655,7 @@
         </w:tc>
         <w:tc>
           <w:tcPr>
-            <w:tcW w:type="dxa" w:w="4500"/>
+            <w:tcW w:type="dxa" w:w="4944"/>
             <w:tcBorders>
               <w:top w:val="single" w:color="BFBFBF" w:sz="4"/>
               <w:left w:val="single" w:color="BFBFBF" w:sz="4"/>
@@ -14681,7 +14681,7 @@
         </w:tc>
         <w:tc>
           <w:tcPr>
-            <w:tcW w:type="dxa" w:w="1955"/>
+            <w:tcW w:type="dxa" w:w="1797"/>
             <w:tcBorders>
               <w:top w:val="single" w:color="BFBFBF" w:sz="4"/>
               <w:left w:val="single" w:color="BFBFBF" w:sz="4"/>
@@ -14713,7 +14713,7 @@
         </w:trPr>
         <w:tc>
           <w:tcPr>
-            <w:tcW w:type="dxa" w:w="2905"/>
+            <w:tcW w:type="dxa" w:w="2619"/>
             <w:tcBorders>
               <w:top w:val="single" w:color="BFBFBF" w:sz="4"/>
               <w:left w:val="single" w:color="BFBFBF" w:sz="4"/>
@@ -14739,7 +14739,7 @@
         </w:tc>
         <w:tc>
           <w:tcPr>
-            <w:tcW w:type="dxa" w:w="4500"/>
+            <w:tcW w:type="dxa" w:w="4944"/>
             <w:tcBorders>
               <w:top w:val="single" w:color="BFBFBF" w:sz="4"/>
               <w:left w:val="single" w:color="BFBFBF" w:sz="4"/>
@@ -14765,7 +14765,7 @@
         </w:tc>
         <w:tc>
           <w:tcPr>
-            <w:tcW w:type="dxa" w:w="1955"/>
+            <w:tcW w:type="dxa" w:w="1797"/>
             <w:tcBorders>
               <w:top w:val="single" w:color="BFBFBF" w:sz="4"/>
               <w:left w:val="single" w:color="BFBFBF" w:sz="4"/>
@@ -14797,7 +14797,7 @@
         </w:trPr>
         <w:tc>
           <w:tcPr>
-            <w:tcW w:type="dxa" w:w="2905"/>
+            <w:tcW w:type="dxa" w:w="2619"/>
             <w:tcBorders>
               <w:top w:val="single" w:color="BFBFBF" w:sz="4"/>
               <w:left w:val="single" w:color="BFBFBF" w:sz="4"/>
@@ -14823,7 +14823,7 @@
         </w:tc>
         <w:tc>
           <w:tcPr>
-            <w:tcW w:type="dxa" w:w="4500"/>
+            <w:tcW w:type="dxa" w:w="4944"/>
             <w:tcBorders>
               <w:top w:val="single" w:color="BFBFBF" w:sz="4"/>
               <w:left w:val="single" w:color="BFBFBF" w:sz="4"/>
@@ -14849,7 +14849,7 @@
         </w:tc>
         <w:tc>
           <w:tcPr>
-            <w:tcW w:type="dxa" w:w="1955"/>
+            <w:tcW w:type="dxa" w:w="1797"/>
             <w:tcBorders>
               <w:top w:val="single" w:color="BFBFBF" w:sz="4"/>
               <w:left w:val="single" w:color="BFBFBF" w:sz="4"/>
@@ -14881,7 +14881,7 @@
         </w:trPr>
         <w:tc>
           <w:tcPr>
-            <w:tcW w:type="dxa" w:w="2905"/>
+            <w:tcW w:type="dxa" w:w="2619"/>
             <w:tcBorders>
               <w:top w:val="single" w:color="BFBFBF" w:sz="4"/>
               <w:left w:val="single" w:color="BFBFBF" w:sz="4"/>
@@ -14907,7 +14907,7 @@
         </w:tc>
         <w:tc>
           <w:tcPr>
-            <w:tcW w:type="dxa" w:w="4500"/>
+            <w:tcW w:type="dxa" w:w="4944"/>
             <w:tcBorders>
               <w:top w:val="single" w:color="BFBFBF" w:sz="4"/>
               <w:left w:val="single" w:color="BFBFBF" w:sz="4"/>
@@ -14933,7 +14933,7 @@
         </w:tc>
         <w:tc>
           <w:tcPr>
-            <w:tcW w:type="dxa" w:w="1955"/>
+            <w:tcW w:type="dxa" w:w="1797"/>
             <w:tcBorders>
               <w:top w:val="single" w:color="BFBFBF" w:sz="4"/>
               <w:left w:val="single" w:color="BFBFBF" w:sz="4"/>
@@ -14965,7 +14965,7 @@
         </w:trPr>
         <w:tc>
           <w:tcPr>
-            <w:tcW w:type="dxa" w:w="2905"/>
+            <w:tcW w:type="dxa" w:w="2619"/>
             <w:tcBorders>
               <w:top w:val="single" w:color="BFBFBF" w:sz="4"/>
               <w:left w:val="single" w:color="BFBFBF" w:sz="4"/>
@@ -14991,7 +14991,7 @@
         </w:tc>
         <w:tc>
           <w:tcPr>
-            <w:tcW w:type="dxa" w:w="4500"/>
+            <w:tcW w:type="dxa" w:w="4944"/>
             <w:tcBorders>
               <w:top w:val="single" w:color="BFBFBF" w:sz="4"/>
               <w:left w:val="single" w:color="BFBFBF" w:sz="4"/>
@@ -15017,7 +15017,7 @@
         </w:tc>
         <w:tc>
           <w:tcPr>
-            <w:tcW w:type="dxa" w:w="1955"/>
+            <w:tcW w:type="dxa" w:w="1797"/>
             <w:tcBorders>
               <w:top w:val="single" w:color="BFBFBF" w:sz="4"/>
               <w:left w:val="single" w:color="BFBFBF" w:sz="4"/>
@@ -15049,7 +15049,7 @@
         </w:trPr>
         <w:tc>
           <w:tcPr>
-            <w:tcW w:type="dxa" w:w="2905"/>
+            <w:tcW w:type="dxa" w:w="2619"/>
             <w:tcBorders>
               <w:top w:val="single" w:color="BFBFBF" w:sz="4"/>
               <w:left w:val="single" w:color="BFBFBF" w:sz="4"/>
@@ -15075,7 +15075,7 @@
         </w:tc>
         <w:tc>
           <w:tcPr>
-            <w:tcW w:type="dxa" w:w="4500"/>
+            <w:tcW w:type="dxa" w:w="4944"/>
             <w:tcBorders>
               <w:top w:val="single" w:color="BFBFBF" w:sz="4"/>
               <w:left w:val="single" w:color="BFBFBF" w:sz="4"/>
@@ -15101,7 +15101,7 @@
         </w:tc>
         <w:tc>
           <w:tcPr>
-            <w:tcW w:type="dxa" w:w="1955"/>
+            <w:tcW w:type="dxa" w:w="1797"/>
             <w:tcBorders>
               <w:top w:val="single" w:color="BFBFBF" w:sz="4"/>
               <w:left w:val="single" w:color="BFBFBF" w:sz="4"/>
@@ -15133,7 +15133,7 @@
         </w:trPr>
         <w:tc>
           <w:tcPr>
-            <w:tcW w:type="dxa" w:w="2905"/>
+            <w:tcW w:type="dxa" w:w="2619"/>
             <w:tcBorders>
               <w:top w:val="single" w:color="BFBFBF" w:sz="4"/>
               <w:left w:val="single" w:color="BFBFBF" w:sz="4"/>
@@ -15159,7 +15159,7 @@
         </w:tc>
         <w:tc>
           <w:tcPr>
-            <w:tcW w:type="dxa" w:w="4500"/>
+            <w:tcW w:type="dxa" w:w="4944"/>
             <w:tcBorders>
               <w:top w:val="single" w:color="BFBFBF" w:sz="4"/>
               <w:left w:val="single" w:color="BFBFBF" w:sz="4"/>
@@ -15185,7 +15185,7 @@
         </w:tc>
         <w:tc>
           <w:tcPr>
-            <w:tcW w:type="dxa" w:w="1955"/>
+            <w:tcW w:type="dxa" w:w="1797"/>
             <w:tcBorders>
               <w:top w:val="single" w:color="BFBFBF" w:sz="4"/>
               <w:left w:val="single" w:color="BFBFBF" w:sz="4"/>
@@ -15217,7 +15217,7 @@
         </w:trPr>
         <w:tc>
           <w:tcPr>
-            <w:tcW w:type="dxa" w:w="2905"/>
+            <w:tcW w:type="dxa" w:w="2619"/>
             <w:tcBorders>
               <w:top w:val="single" w:color="BFBFBF" w:sz="4"/>
               <w:left w:val="single" w:color="BFBFBF" w:sz="4"/>
@@ -15243,7 +15243,7 @@
         </w:tc>
         <w:tc>
           <w:tcPr>
-            <w:tcW w:type="dxa" w:w="4500"/>
+            <w:tcW w:type="dxa" w:w="4944"/>
             <w:tcBorders>
               <w:top w:val="single" w:color="BFBFBF" w:sz="4"/>
               <w:left w:val="single" w:color="BFBFBF" w:sz="4"/>
@@ -15269,7 +15269,7 @@
         </w:tc>
         <w:tc>
           <w:tcPr>
-            <w:tcW w:type="dxa" w:w="1955"/>
+            <w:tcW w:type="dxa" w:w="1797"/>
             <w:tcBorders>
               <w:top w:val="single" w:color="BFBFBF" w:sz="4"/>
               <w:left w:val="single" w:color="BFBFBF" w:sz="4"/>
@@ -15301,7 +15301,7 @@
         </w:trPr>
         <w:tc>
           <w:tcPr>
-            <w:tcW w:type="dxa" w:w="2905"/>
+            <w:tcW w:type="dxa" w:w="2619"/>
             <w:tcBorders>
               <w:top w:val="single" w:color="BFBFBF" w:sz="4"/>
               <w:left w:val="single" w:color="BFBFBF" w:sz="4"/>
@@ -15327,7 +15327,7 @@
         </w:tc>
         <w:tc>
           <w:tcPr>
-            <w:tcW w:type="dxa" w:w="4500"/>
+            <w:tcW w:type="dxa" w:w="4944"/>
             <w:tcBorders>
               <w:top w:val="single" w:color="BFBFBF" w:sz="4"/>
               <w:left w:val="single" w:color="BFBFBF" w:sz="4"/>
@@ -15353,7 +15353,7 @@
         </w:tc>
         <w:tc>
           <w:tcPr>
-            <w:tcW w:type="dxa" w:w="1955"/>
+            <w:tcW w:type="dxa" w:w="1797"/>
             <w:tcBorders>
               <w:top w:val="single" w:color="BFBFBF" w:sz="4"/>
               <w:left w:val="single" w:color="BFBFBF" w:sz="4"/>
@@ -15385,7 +15385,7 @@
         </w:trPr>
         <w:tc>
           <w:tcPr>
-            <w:tcW w:type="dxa" w:w="2905"/>
+            <w:tcW w:type="dxa" w:w="2619"/>
             <w:tcBorders>
               <w:top w:val="single" w:color="BFBFBF" w:sz="4"/>
               <w:left w:val="single" w:color="BFBFBF" w:sz="4"/>
@@ -15411,7 +15411,7 @@
         </w:tc>
         <w:tc>
           <w:tcPr>
-            <w:tcW w:type="dxa" w:w="4500"/>
+            <w:tcW w:type="dxa" w:w="4944"/>
             <w:tcBorders>
               <w:top w:val="single" w:color="BFBFBF" w:sz="4"/>
               <w:left w:val="single" w:color="BFBFBF" w:sz="4"/>
@@ -15437,7 +15437,7 @@
         </w:tc>
         <w:tc>
           <w:tcPr>
-            <w:tcW w:type="dxa" w:w="1955"/>
+            <w:tcW w:type="dxa" w:w="1797"/>
             <w:tcBorders>
               <w:top w:val="single" w:color="BFBFBF" w:sz="4"/>
               <w:left w:val="single" w:color="BFBFBF" w:sz="4"/>
@@ -15469,7 +15469,7 @@
         </w:trPr>
         <w:tc>
           <w:tcPr>
-            <w:tcW w:type="dxa" w:w="2905"/>
+            <w:tcW w:type="dxa" w:w="2619"/>
             <w:tcBorders>
               <w:top w:val="single" w:color="BFBFBF" w:sz="4"/>
               <w:left w:val="single" w:color="BFBFBF" w:sz="4"/>
@@ -15495,7 +15495,7 @@
         </w:tc>
         <w:tc>
           <w:tcPr>
-            <w:tcW w:type="dxa" w:w="4500"/>
+            <w:tcW w:type="dxa" w:w="4944"/>
             <w:tcBorders>
               <w:top w:val="single" w:color="BFBFBF" w:sz="4"/>
               <w:left w:val="single" w:color="BFBFBF" w:sz="4"/>
@@ -15521,7 +15521,7 @@
         </w:tc>
         <w:tc>
           <w:tcPr>
-            <w:tcW w:type="dxa" w:w="1955"/>
+            <w:tcW w:type="dxa" w:w="1797"/>
             <w:tcBorders>
               <w:top w:val="single" w:color="BFBFBF" w:sz="4"/>
               <w:left w:val="single" w:color="BFBFBF" w:sz="4"/>
@@ -15553,7 +15553,7 @@
         </w:trPr>
         <w:tc>
           <w:tcPr>
-            <w:tcW w:type="dxa" w:w="2905"/>
+            <w:tcW w:type="dxa" w:w="2619"/>
             <w:tcBorders>
               <w:top w:val="single" w:color="BFBFBF" w:sz="4"/>
               <w:left w:val="single" w:color="BFBFBF" w:sz="4"/>
@@ -15579,7 +15579,7 @@
         </w:tc>
         <w:tc>
           <w:tcPr>
-            <w:tcW w:type="dxa" w:w="4500"/>
+            <w:tcW w:type="dxa" w:w="4944"/>
             <w:tcBorders>
               <w:top w:val="single" w:color="BFBFBF" w:sz="4"/>
               <w:left w:val="single" w:color="BFBFBF" w:sz="4"/>
@@ -15605,7 +15605,7 @@
         </w:tc>
         <w:tc>
           <w:tcPr>
-            <w:tcW w:type="dxa" w:w="1955"/>
+            <w:tcW w:type="dxa" w:w="1797"/>
             <w:tcBorders>
               <w:top w:val="single" w:color="BFBFBF" w:sz="4"/>
               <w:left w:val="single" w:color="BFBFBF" w:sz="4"/>
@@ -15637,7 +15637,7 @@
         </w:trPr>
         <w:tc>
           <w:tcPr>
-            <w:tcW w:type="dxa" w:w="2905"/>
+            <w:tcW w:type="dxa" w:w="2619"/>
             <w:tcBorders>
               <w:top w:val="single" w:color="BFBFBF" w:sz="4"/>
               <w:left w:val="single" w:color="BFBFBF" w:sz="4"/>
@@ -15663,7 +15663,7 @@
         </w:tc>
         <w:tc>
           <w:tcPr>
-            <w:tcW w:type="dxa" w:w="4500"/>
+            <w:tcW w:type="dxa" w:w="4944"/>
             <w:tcBorders>
               <w:top w:val="single" w:color="BFBFBF" w:sz="4"/>
               <w:left w:val="single" w:color="BFBFBF" w:sz="4"/>
@@ -15689,7 +15689,7 @@
         </w:tc>
         <w:tc>
           <w:tcPr>
-            <w:tcW w:type="dxa" w:w="1955"/>
+            <w:tcW w:type="dxa" w:w="1797"/>
             <w:tcBorders>
               <w:top w:val="single" w:color="BFBFBF" w:sz="4"/>
               <w:left w:val="single" w:color="BFBFBF" w:sz="4"/>
@@ -15721,7 +15721,7 @@
         </w:trPr>
         <w:tc>
           <w:tcPr>
-            <w:tcW w:type="dxa" w:w="2905"/>
+            <w:tcW w:type="dxa" w:w="2619"/>
             <w:tcBorders>
               <w:top w:val="single" w:color="BFBFBF" w:sz="4"/>
               <w:left w:val="single" w:color="BFBFBF" w:sz="4"/>
@@ -15747,7 +15747,7 @@
         </w:tc>
         <w:tc>
           <w:tcPr>
-            <w:tcW w:type="dxa" w:w="4500"/>
+            <w:tcW w:type="dxa" w:w="4944"/>
             <w:tcBorders>
               <w:top w:val="single" w:color="BFBFBF" w:sz="4"/>
               <w:left w:val="single" w:color="BFBFBF" w:sz="4"/>
@@ -15773,7 +15773,7 @@
         </w:tc>
         <w:tc>
           <w:tcPr>
-            <w:tcW w:type="dxa" w:w="1955"/>
+            <w:tcW w:type="dxa" w:w="1797"/>
             <w:tcBorders>
               <w:top w:val="single" w:color="BFBFBF" w:sz="4"/>
               <w:left w:val="single" w:color="BFBFBF" w:sz="4"/>
@@ -15805,7 +15805,7 @@
         </w:trPr>
         <w:tc>
           <w:tcPr>
-            <w:tcW w:type="dxa" w:w="2905"/>
+            <w:tcW w:type="dxa" w:w="2619"/>
             <w:tcBorders>
               <w:top w:val="single" w:color="BFBFBF" w:sz="4"/>
               <w:left w:val="single" w:color="BFBFBF" w:sz="4"/>
@@ -15831,7 +15831,7 @@
         </w:tc>
         <w:tc>
           <w:tcPr>
-            <w:tcW w:type="dxa" w:w="4500"/>
+            <w:tcW w:type="dxa" w:w="4944"/>
             <w:tcBorders>
               <w:top w:val="single" w:color="BFBFBF" w:sz="4"/>
               <w:left w:val="single" w:color="BFBFBF" w:sz="4"/>
@@ -15857,7 +15857,7 @@
         </w:tc>
         <w:tc>
           <w:tcPr>
-            <w:tcW w:type="dxa" w:w="1955"/>
+            <w:tcW w:type="dxa" w:w="1797"/>
             <w:tcBorders>
               <w:top w:val="single" w:color="BFBFBF" w:sz="4"/>
               <w:left w:val="single" w:color="BFBFBF" w:sz="4"/>
@@ -15889,7 +15889,7 @@
         </w:trPr>
         <w:tc>
           <w:tcPr>
-            <w:tcW w:type="dxa" w:w="2905"/>
+            <w:tcW w:type="dxa" w:w="2619"/>
             <w:tcBorders>
               <w:top w:val="single" w:color="BFBFBF" w:sz="4"/>
               <w:left w:val="single" w:color="BFBFBF" w:sz="4"/>
@@ -15915,7 +15915,7 @@
         </w:tc>
         <w:tc>
           <w:tcPr>
-            <w:tcW w:type="dxa" w:w="4500"/>
+            <w:tcW w:type="dxa" w:w="4944"/>
             <w:tcBorders>
               <w:top w:val="single" w:color="BFBFBF" w:sz="4"/>
               <w:left w:val="single" w:color="BFBFBF" w:sz="4"/>
@@ -15941,7 +15941,7 @@
         </w:tc>
         <w:tc>
           <w:tcPr>
-            <w:tcW w:type="dxa" w:w="1955"/>
+            <w:tcW w:type="dxa" w:w="1797"/>
             <w:tcBorders>
               <w:top w:val="single" w:color="BFBFBF" w:sz="4"/>
               <w:left w:val="single" w:color="BFBFBF" w:sz="4"/>
@@ -15973,7 +15973,7 @@
         </w:trPr>
         <w:tc>
           <w:tcPr>
-            <w:tcW w:type="dxa" w:w="2905"/>
+            <w:tcW w:type="dxa" w:w="2619"/>
             <w:tcBorders>
               <w:top w:val="single" w:color="BFBFBF" w:sz="4"/>
               <w:left w:val="single" w:color="BFBFBF" w:sz="4"/>
@@ -15999,7 +15999,7 @@
         </w:tc>
         <w:tc>
           <w:tcPr>
-            <w:tcW w:type="dxa" w:w="4500"/>
+            <w:tcW w:type="dxa" w:w="4944"/>
             <w:tcBorders>
               <w:top w:val="single" w:color="BFBFBF" w:sz="4"/>
               <w:left w:val="single" w:color="BFBFBF" w:sz="4"/>
@@ -16025,7 +16025,7 @@
         </w:tc>
         <w:tc>
           <w:tcPr>
-            <w:tcW w:type="dxa" w:w="1955"/>
+            <w:tcW w:type="dxa" w:w="1797"/>
             <w:tcBorders>
               <w:top w:val="single" w:color="BFBFBF" w:sz="4"/>
               <w:left w:val="single" w:color="BFBFBF" w:sz="4"/>
@@ -16057,7 +16057,7 @@
         </w:trPr>
         <w:tc>
           <w:tcPr>
-            <w:tcW w:type="dxa" w:w="2905"/>
+            <w:tcW w:type="dxa" w:w="2619"/>
             <w:tcBorders>
               <w:top w:val="single" w:color="BFBFBF" w:sz="4"/>
               <w:left w:val="single" w:color="BFBFBF" w:sz="4"/>
@@ -16083,7 +16083,7 @@
         </w:tc>
         <w:tc>
           <w:tcPr>
-            <w:tcW w:type="dxa" w:w="4500"/>
+            <w:tcW w:type="dxa" w:w="4944"/>
             <w:tcBorders>
               <w:top w:val="single" w:color="BFBFBF" w:sz="4"/>
               <w:left w:val="single" w:color="BFBFBF" w:sz="4"/>
@@ -16109,7 +16109,7 @@
         </w:tc>
         <w:tc>
           <w:tcPr>
-            <w:tcW w:type="dxa" w:w="1955"/>
+            <w:tcW w:type="dxa" w:w="1797"/>
             <w:tcBorders>
               <w:top w:val="single" w:color="BFBFBF" w:sz="4"/>
               <w:left w:val="single" w:color="BFBFBF" w:sz="4"/>
@@ -16141,7 +16141,7 @@
         </w:trPr>
         <w:tc>
           <w:tcPr>
-            <w:tcW w:type="dxa" w:w="2905"/>
+            <w:tcW w:type="dxa" w:w="2619"/>
             <w:tcBorders>
               <w:top w:val="single" w:color="BFBFBF" w:sz="4"/>
               <w:left w:val="single" w:color="BFBFBF" w:sz="4"/>
@@ -16167,7 +16167,7 @@
         </w:tc>
         <w:tc>
           <w:tcPr>
-            <w:tcW w:type="dxa" w:w="4500"/>
+            <w:tcW w:type="dxa" w:w="4944"/>
             <w:tcBorders>
               <w:top w:val="single" w:color="BFBFBF" w:sz="4"/>
               <w:left w:val="single" w:color="BFBFBF" w:sz="4"/>
@@ -16193,7 +16193,7 @@
         </w:tc>
         <w:tc>
           <w:tcPr>
-            <w:tcW w:type="dxa" w:w="1955"/>
+            <w:tcW w:type="dxa" w:w="1797"/>
             <w:tcBorders>
               <w:top w:val="single" w:color="BFBFBF" w:sz="4"/>
               <w:left w:val="single" w:color="BFBFBF" w:sz="4"/>
@@ -16225,7 +16225,7 @@
         </w:trPr>
         <w:tc>
           <w:tcPr>
-            <w:tcW w:type="dxa" w:w="2905"/>
+            <w:tcW w:type="dxa" w:w="2619"/>
             <w:tcBorders>
               <w:top w:val="single" w:color="BFBFBF" w:sz="4"/>
               <w:left w:val="single" w:color="BFBFBF" w:sz="4"/>
@@ -16251,7 +16251,7 @@
         </w:tc>
         <w:tc>
           <w:tcPr>
-            <w:tcW w:type="dxa" w:w="4500"/>
+            <w:tcW w:type="dxa" w:w="4944"/>
             <w:tcBorders>
               <w:top w:val="single" w:color="BFBFBF" w:sz="4"/>
               <w:left w:val="single" w:color="BFBFBF" w:sz="4"/>
@@ -16277,7 +16277,7 @@
         </w:tc>
         <w:tc>
           <w:tcPr>
-            <w:tcW w:type="dxa" w:w="1955"/>
+            <w:tcW w:type="dxa" w:w="1797"/>
             <w:tcBorders>
               <w:top w:val="single" w:color="BFBFBF" w:sz="4"/>
               <w:left w:val="single" w:color="BFBFBF" w:sz="4"/>
@@ -16309,7 +16309,7 @@
         </w:trPr>
         <w:tc>
           <w:tcPr>
-            <w:tcW w:type="dxa" w:w="2905"/>
+            <w:tcW w:type="dxa" w:w="2619"/>
             <w:tcBorders>
               <w:top w:val="single" w:color="BFBFBF" w:sz="4"/>
               <w:left w:val="single" w:color="BFBFBF" w:sz="4"/>
@@ -16335,7 +16335,7 @@
         </w:tc>
         <w:tc>
           <w:tcPr>
-            <w:tcW w:type="dxa" w:w="4500"/>
+            <w:tcW w:type="dxa" w:w="4944"/>
             <w:tcBorders>
               <w:top w:val="single" w:color="BFBFBF" w:sz="4"/>
               <w:left w:val="single" w:color="BFBFBF" w:sz="4"/>
@@ -16361,7 +16361,7 @@
         </w:tc>
         <w:tc>
           <w:tcPr>
-            <w:tcW w:type="dxa" w:w="1955"/>
+            <w:tcW w:type="dxa" w:w="1797"/>
             <w:tcBorders>
               <w:top w:val="single" w:color="BFBFBF" w:sz="4"/>
               <w:left w:val="single" w:color="BFBFBF" w:sz="4"/>
@@ -16393,7 +16393,7 @@
         </w:trPr>
         <w:tc>
           <w:tcPr>
-            <w:tcW w:type="dxa" w:w="2905"/>
+            <w:tcW w:type="dxa" w:w="2619"/>
             <w:tcBorders>
               <w:top w:val="single" w:color="BFBFBF" w:sz="4"/>
               <w:left w:val="single" w:color="BFBFBF" w:sz="4"/>
@@ -16419,7 +16419,7 @@
         </w:tc>
         <w:tc>
           <w:tcPr>
-            <w:tcW w:type="dxa" w:w="4500"/>
+            <w:tcW w:type="dxa" w:w="4944"/>
             <w:tcBorders>
               <w:top w:val="single" w:color="BFBFBF" w:sz="4"/>
               <w:left w:val="single" w:color="BFBFBF" w:sz="4"/>
@@ -16445,7 +16445,7 @@
         </w:tc>
         <w:tc>
           <w:tcPr>
-            <w:tcW w:type="dxa" w:w="1955"/>
+            <w:tcW w:type="dxa" w:w="1797"/>
             <w:tcBorders>
               <w:top w:val="single" w:color="BFBFBF" w:sz="4"/>
               <w:left w:val="single" w:color="BFBFBF" w:sz="4"/>
@@ -16477,7 +16477,7 @@
         </w:trPr>
         <w:tc>
           <w:tcPr>
-            <w:tcW w:type="dxa" w:w="2905"/>
+            <w:tcW w:type="dxa" w:w="2619"/>
             <w:tcBorders>
               <w:top w:val="single" w:color="BFBFBF" w:sz="4"/>
               <w:left w:val="single" w:color="BFBFBF" w:sz="4"/>
@@ -16503,7 +16503,7 @@
         </w:tc>
         <w:tc>
           <w:tcPr>
-            <w:tcW w:type="dxa" w:w="4500"/>
+            <w:tcW w:type="dxa" w:w="4944"/>
             <w:tcBorders>
               <w:top w:val="single" w:color="BFBFBF" w:sz="4"/>
               <w:left w:val="single" w:color="BFBFBF" w:sz="4"/>
@@ -16529,7 +16529,7 @@
         </w:tc>
         <w:tc>
           <w:tcPr>
-            <w:tcW w:type="dxa" w:w="1955"/>
+            <w:tcW w:type="dxa" w:w="1797"/>
             <w:tcBorders>
               <w:top w:val="single" w:color="BFBFBF" w:sz="4"/>
               <w:left w:val="single" w:color="BFBFBF" w:sz="4"/>
@@ -16561,7 +16561,7 @@
         </w:trPr>
         <w:tc>
           <w:tcPr>
-            <w:tcW w:type="dxa" w:w="2905"/>
+            <w:tcW w:type="dxa" w:w="2619"/>
             <w:tcBorders>
               <w:top w:val="single" w:color="BFBFBF" w:sz="4"/>
               <w:left w:val="single" w:color="BFBFBF" w:sz="4"/>
@@ -16587,7 +16587,7 @@
         </w:tc>
         <w:tc>
           <w:tcPr>
-            <w:tcW w:type="dxa" w:w="4500"/>
+            <w:tcW w:type="dxa" w:w="4944"/>
             <w:tcBorders>
               <w:top w:val="single" w:color="BFBFBF" w:sz="4"/>
               <w:left w:val="single" w:color="BFBFBF" w:sz="4"/>
@@ -16613,7 +16613,7 @@
         </w:tc>
         <w:tc>
           <w:tcPr>
-            <w:tcW w:type="dxa" w:w="1955"/>
+            <w:tcW w:type="dxa" w:w="1797"/>
             <w:tcBorders>
               <w:top w:val="single" w:color="BFBFBF" w:sz="4"/>
               <w:left w:val="single" w:color="BFBFBF" w:sz="4"/>
@@ -16645,7 +16645,7 @@
         </w:trPr>
         <w:tc>
           <w:tcPr>
-            <w:tcW w:type="dxa" w:w="2905"/>
+            <w:tcW w:type="dxa" w:w="2619"/>
             <w:tcBorders>
               <w:top w:val="single" w:color="BFBFBF" w:sz="4"/>
               <w:left w:val="single" w:color="BFBFBF" w:sz="4"/>
@@ -16671,7 +16671,7 @@
         </w:tc>
         <w:tc>
           <w:tcPr>
-            <w:tcW w:type="dxa" w:w="4500"/>
+            <w:tcW w:type="dxa" w:w="4944"/>
             <w:tcBorders>
               <w:top w:val="single" w:color="BFBFBF" w:sz="4"/>
               <w:left w:val="single" w:color="BFBFBF" w:sz="4"/>
@@ -16697,7 +16697,100 @@
         </w:tc>
         <w:tc>
           <w:tcPr>
-            <w:tcW w:type="dxa" w:w="1955"/>
+            <w:tcW w:type="dxa" w:w="1797"/>
+            <w:tcBorders>
+              <w:top w:val="single" w:color="BFBFBF" w:sz="4"/>
+              <w:left w:val="single" w:color="BFBFBF" w:sz="4"/>
+              <w:bottom w:val="single" w:color="BFBFBF" w:sz="4"/>
+              <w:right w:val="single" w:color="BFBFBF" w:sz="4"/>
+            </w:tcBorders>
+            <w:tcMar>
+              <w:top w:type="dxa" w:w="60"/>
+              <w:left w:type="dxa" w:w="100"/>
+              <w:bottom w:type="dxa" w:w="60"/>
+              <w:right w:type="dxa" w:w="100"/>
+            </w:tcMar>
+          </w:tcPr>
+          <w:p>
+            <w:r>
+              <w:rPr>
+                <w:sz w:val="20"/>
+                <w:szCs w:val="20"/>
+              </w:rPr>
+              <w:t xml:space="preserve">2026-10-04</w:t>
+            </w:r>
+          </w:p>
+        </w:tc>
+      </w:tr>
+      <w:tr>
+        <w:trPr>
+          <w:cantSplit/>
+          <w:tblHeader w:val="off"/>
+        </w:trPr>
+        <w:tc>
+          <w:tcPr>
+            <w:tcW w:type="dxa" w:w="2619"/>
+            <w:tcBorders>
+              <w:top w:val="single" w:color="BFBFBF" w:sz="4"/>
+              <w:left w:val="single" w:color="BFBFBF" w:sz="4"/>
+              <w:bottom w:val="single" w:color="BFBFBF" w:sz="4"/>
+              <w:right w:val="single" w:color="BFBFBF" w:sz="4"/>
+            </w:tcBorders>
+            <w:tcMar>
+              <w:top w:type="dxa" w:w="60"/>
+              <w:left w:type="dxa" w:w="100"/>
+              <w:bottom w:type="dxa" w:w="60"/>
+              <w:right w:type="dxa" w:w="100"/>
+            </w:tcMar>
+          </w:tcPr>
+          <w:p>
+            <w:r>
+              <w:rPr>
+                <w:sz w:val="20"/>
+                <w:szCs w:val="20"/>
+              </w:rPr>
+              <w:t xml:space="preserve">Code hosting (A7)</w:t>
+            </w:r>
+          </w:p>
+        </w:tc>
+        <w:tc>
+          <w:tcPr>
+            <w:tcW w:type="dxa" w:w="4944"/>
+            <w:tcBorders>
+              <w:top w:val="single" w:color="BFBFBF" w:sz="4"/>
+              <w:left w:val="single" w:color="BFBFBF" w:sz="4"/>
+              <w:bottom w:val="single" w:color="BFBFBF" w:sz="4"/>
+              <w:right w:val="single" w:color="BFBFBF" w:sz="4"/>
+            </w:tcBorders>
+            <w:tcMar>
+              <w:top w:type="dxa" w:w="60"/>
+              <w:left w:type="dxa" w:w="100"/>
+              <w:bottom w:type="dxa" w:w="60"/>
+              <w:right w:type="dxa" w:w="100"/>
+            </w:tcMar>
+          </w:tcPr>
+          <w:p>
+            <w:r>
+              <w:rPr>
+                <w:sz w:val="20"/>
+                <w:szCs w:val="20"/>
+              </w:rPr>
+              <w:t xml:space="preserve">Private GitHub repository </w:t>
+            </w:r>
+            <w:r>
+              <w:rPr>
+                <w:rFonts w:ascii="Consolas" w:cs="Consolas" w:eastAsia="Consolas" w:hAnsi="Consolas"/>
+                <w:sz w:val="18"/>
+                <w:szCs w:val="18"/>
+                <w:shd w:fill="F0F0F0" w:val="clear"/>
+              </w:rPr>
+              <w:t xml:space="preserve">sachinkuber/marketing.sarathi.gvcc.in</w:t>
+            </w:r>
+          </w:p>
+        </w:tc>
+        <w:tc>
+          <w:tcPr>
+            <w:tcW w:type="dxa" w:w="1797"/>
             <w:tcBorders>
               <w:top w:val="single" w:color="BFBFBF" w:sz="4"/>
               <w:left w:val="single" w:color="BFBFBF" w:sz="4"/>

</xml_diff>

<commit_message>
docs: Phase 1 spec v5 - per-process brand limit
Approved by the owner on 2026-10-04 after the queue trial showed the
library's global group limit is exceeded under concurrent fetches.
Sections 3, 9.2, 9.3 and 19 only.

Co-Authored-By: Claude Opus 5.5 <noreply@anthropic.com>
Claude-Session: https://claude.ai/code/session_01KxscWn9fSBZzY3BEJFGfy4
</commit_message>
<xml_diff>
--- a/docs/sachin-to-provide.docx
+++ b/docs/sachin-to-provide.docx
@@ -13853,9 +13853,9 @@
         </w:tblBorders>
       </w:tblPr>
       <w:tblGrid>
-        <w:gridCol w:w="2619"/>
-        <w:gridCol w:w="4944"/>
-        <w:gridCol w:w="1797"/>
+        <w:gridCol w:w="2608"/>
+        <w:gridCol w:w="4965"/>
+        <w:gridCol w:w="1787"/>
       </w:tblGrid>
       <w:tr>
         <w:trPr>
@@ -13864,7 +13864,7 @@
         </w:trPr>
         <w:tc>
           <w:tcPr>
-            <w:tcW w:type="dxa" w:w="2619"/>
+            <w:tcW w:type="dxa" w:w="2608"/>
             <w:tcBorders>
               <w:top w:val="single" w:color="BFBFBF" w:sz="4"/>
               <w:left w:val="single" w:color="BFBFBF" w:sz="4"/>
@@ -13893,7 +13893,7 @@
         </w:tc>
         <w:tc>
           <w:tcPr>
-            <w:tcW w:type="dxa" w:w="4944"/>
+            <w:tcW w:type="dxa" w:w="4965"/>
             <w:tcBorders>
               <w:top w:val="single" w:color="BFBFBF" w:sz="4"/>
               <w:left w:val="single" w:color="BFBFBF" w:sz="4"/>
@@ -13922,7 +13922,7 @@
         </w:tc>
         <w:tc>
           <w:tcPr>
-            <w:tcW w:type="dxa" w:w="1797"/>
+            <w:tcW w:type="dxa" w:w="1787"/>
             <w:tcBorders>
               <w:top w:val="single" w:color="BFBFBF" w:sz="4"/>
               <w:left w:val="single" w:color="BFBFBF" w:sz="4"/>
@@ -13957,7 +13957,7 @@
         </w:trPr>
         <w:tc>
           <w:tcPr>
-            <w:tcW w:type="dxa" w:w="2619"/>
+            <w:tcW w:type="dxa" w:w="2608"/>
             <w:tcBorders>
               <w:top w:val="single" w:color="BFBFBF" w:sz="4"/>
               <w:left w:val="single" w:color="BFBFBF" w:sz="4"/>
@@ -13983,7 +13983,7 @@
         </w:tc>
         <w:tc>
           <w:tcPr>
-            <w:tcW w:type="dxa" w:w="4944"/>
+            <w:tcW w:type="dxa" w:w="4965"/>
             <w:tcBorders>
               <w:top w:val="single" w:color="BFBFBF" w:sz="4"/>
               <w:left w:val="single" w:color="BFBFBF" w:sz="4"/>
@@ -14009,7 +14009,7 @@
         </w:tc>
         <w:tc>
           <w:tcPr>
-            <w:tcW w:type="dxa" w:w="1797"/>
+            <w:tcW w:type="dxa" w:w="1787"/>
             <w:tcBorders>
               <w:top w:val="single" w:color="BFBFBF" w:sz="4"/>
               <w:left w:val="single" w:color="BFBFBF" w:sz="4"/>
@@ -14041,7 +14041,7 @@
         </w:trPr>
         <w:tc>
           <w:tcPr>
-            <w:tcW w:type="dxa" w:w="2619"/>
+            <w:tcW w:type="dxa" w:w="2608"/>
             <w:tcBorders>
               <w:top w:val="single" w:color="BFBFBF" w:sz="4"/>
               <w:left w:val="single" w:color="BFBFBF" w:sz="4"/>
@@ -14067,7 +14067,7 @@
         </w:tc>
         <w:tc>
           <w:tcPr>
-            <w:tcW w:type="dxa" w:w="4944"/>
+            <w:tcW w:type="dxa" w:w="4965"/>
             <w:tcBorders>
               <w:top w:val="single" w:color="BFBFBF" w:sz="4"/>
               <w:left w:val="single" w:color="BFBFBF" w:sz="4"/>
@@ -14093,7 +14093,7 @@
         </w:tc>
         <w:tc>
           <w:tcPr>
-            <w:tcW w:type="dxa" w:w="1797"/>
+            <w:tcW w:type="dxa" w:w="1787"/>
             <w:tcBorders>
               <w:top w:val="single" w:color="BFBFBF" w:sz="4"/>
               <w:left w:val="single" w:color="BFBFBF" w:sz="4"/>
@@ -14125,7 +14125,7 @@
         </w:trPr>
         <w:tc>
           <w:tcPr>
-            <w:tcW w:type="dxa" w:w="2619"/>
+            <w:tcW w:type="dxa" w:w="2608"/>
             <w:tcBorders>
               <w:top w:val="single" w:color="BFBFBF" w:sz="4"/>
               <w:left w:val="single" w:color="BFBFBF" w:sz="4"/>
@@ -14151,7 +14151,7 @@
         </w:tc>
         <w:tc>
           <w:tcPr>
-            <w:tcW w:type="dxa" w:w="4944"/>
+            <w:tcW w:type="dxa" w:w="4965"/>
             <w:tcBorders>
               <w:top w:val="single" w:color="BFBFBF" w:sz="4"/>
               <w:left w:val="single" w:color="BFBFBF" w:sz="4"/>
@@ -14177,7 +14177,7 @@
         </w:tc>
         <w:tc>
           <w:tcPr>
-            <w:tcW w:type="dxa" w:w="1797"/>
+            <w:tcW w:type="dxa" w:w="1787"/>
             <w:tcBorders>
               <w:top w:val="single" w:color="BFBFBF" w:sz="4"/>
               <w:left w:val="single" w:color="BFBFBF" w:sz="4"/>
@@ -14209,7 +14209,7 @@
         </w:trPr>
         <w:tc>
           <w:tcPr>
-            <w:tcW w:type="dxa" w:w="2619"/>
+            <w:tcW w:type="dxa" w:w="2608"/>
             <w:tcBorders>
               <w:top w:val="single" w:color="BFBFBF" w:sz="4"/>
               <w:left w:val="single" w:color="BFBFBF" w:sz="4"/>
@@ -14235,7 +14235,7 @@
         </w:tc>
         <w:tc>
           <w:tcPr>
-            <w:tcW w:type="dxa" w:w="4944"/>
+            <w:tcW w:type="dxa" w:w="4965"/>
             <w:tcBorders>
               <w:top w:val="single" w:color="BFBFBF" w:sz="4"/>
               <w:left w:val="single" w:color="BFBFBF" w:sz="4"/>
@@ -14261,7 +14261,7 @@
         </w:tc>
         <w:tc>
           <w:tcPr>
-            <w:tcW w:type="dxa" w:w="1797"/>
+            <w:tcW w:type="dxa" w:w="1787"/>
             <w:tcBorders>
               <w:top w:val="single" w:color="BFBFBF" w:sz="4"/>
               <w:left w:val="single" w:color="BFBFBF" w:sz="4"/>
@@ -14293,7 +14293,7 @@
         </w:trPr>
         <w:tc>
           <w:tcPr>
-            <w:tcW w:type="dxa" w:w="2619"/>
+            <w:tcW w:type="dxa" w:w="2608"/>
             <w:tcBorders>
               <w:top w:val="single" w:color="BFBFBF" w:sz="4"/>
               <w:left w:val="single" w:color="BFBFBF" w:sz="4"/>
@@ -14319,7 +14319,7 @@
         </w:tc>
         <w:tc>
           <w:tcPr>
-            <w:tcW w:type="dxa" w:w="4944"/>
+            <w:tcW w:type="dxa" w:w="4965"/>
             <w:tcBorders>
               <w:top w:val="single" w:color="BFBFBF" w:sz="4"/>
               <w:left w:val="single" w:color="BFBFBF" w:sz="4"/>
@@ -14345,7 +14345,7 @@
         </w:tc>
         <w:tc>
           <w:tcPr>
-            <w:tcW w:type="dxa" w:w="1797"/>
+            <w:tcW w:type="dxa" w:w="1787"/>
             <w:tcBorders>
               <w:top w:val="single" w:color="BFBFBF" w:sz="4"/>
               <w:left w:val="single" w:color="BFBFBF" w:sz="4"/>
@@ -14377,7 +14377,7 @@
         </w:trPr>
         <w:tc>
           <w:tcPr>
-            <w:tcW w:type="dxa" w:w="2619"/>
+            <w:tcW w:type="dxa" w:w="2608"/>
             <w:tcBorders>
               <w:top w:val="single" w:color="BFBFBF" w:sz="4"/>
               <w:left w:val="single" w:color="BFBFBF" w:sz="4"/>
@@ -14403,7 +14403,7 @@
         </w:tc>
         <w:tc>
           <w:tcPr>
-            <w:tcW w:type="dxa" w:w="4944"/>
+            <w:tcW w:type="dxa" w:w="4965"/>
             <w:tcBorders>
               <w:top w:val="single" w:color="BFBFBF" w:sz="4"/>
               <w:left w:val="single" w:color="BFBFBF" w:sz="4"/>
@@ -14429,7 +14429,7 @@
         </w:tc>
         <w:tc>
           <w:tcPr>
-            <w:tcW w:type="dxa" w:w="1797"/>
+            <w:tcW w:type="dxa" w:w="1787"/>
             <w:tcBorders>
               <w:top w:val="single" w:color="BFBFBF" w:sz="4"/>
               <w:left w:val="single" w:color="BFBFBF" w:sz="4"/>
@@ -14461,7 +14461,7 @@
         </w:trPr>
         <w:tc>
           <w:tcPr>
-            <w:tcW w:type="dxa" w:w="2619"/>
+            <w:tcW w:type="dxa" w:w="2608"/>
             <w:tcBorders>
               <w:top w:val="single" w:color="BFBFBF" w:sz="4"/>
               <w:left w:val="single" w:color="BFBFBF" w:sz="4"/>
@@ -14487,7 +14487,7 @@
         </w:tc>
         <w:tc>
           <w:tcPr>
-            <w:tcW w:type="dxa" w:w="4944"/>
+            <w:tcW w:type="dxa" w:w="4965"/>
             <w:tcBorders>
               <w:top w:val="single" w:color="BFBFBF" w:sz="4"/>
               <w:left w:val="single" w:color="BFBFBF" w:sz="4"/>
@@ -14513,7 +14513,7 @@
         </w:tc>
         <w:tc>
           <w:tcPr>
-            <w:tcW w:type="dxa" w:w="1797"/>
+            <w:tcW w:type="dxa" w:w="1787"/>
             <w:tcBorders>
               <w:top w:val="single" w:color="BFBFBF" w:sz="4"/>
               <w:left w:val="single" w:color="BFBFBF" w:sz="4"/>
@@ -14545,7 +14545,7 @@
         </w:trPr>
         <w:tc>
           <w:tcPr>
-            <w:tcW w:type="dxa" w:w="2619"/>
+            <w:tcW w:type="dxa" w:w="2608"/>
             <w:tcBorders>
               <w:top w:val="single" w:color="BFBFBF" w:sz="4"/>
               <w:left w:val="single" w:color="BFBFBF" w:sz="4"/>
@@ -14571,7 +14571,7 @@
         </w:tc>
         <w:tc>
           <w:tcPr>
-            <w:tcW w:type="dxa" w:w="4944"/>
+            <w:tcW w:type="dxa" w:w="4965"/>
             <w:tcBorders>
               <w:top w:val="single" w:color="BFBFBF" w:sz="4"/>
               <w:left w:val="single" w:color="BFBFBF" w:sz="4"/>
@@ -14597,7 +14597,7 @@
         </w:tc>
         <w:tc>
           <w:tcPr>
-            <w:tcW w:type="dxa" w:w="1797"/>
+            <w:tcW w:type="dxa" w:w="1787"/>
             <w:tcBorders>
               <w:top w:val="single" w:color="BFBFBF" w:sz="4"/>
               <w:left w:val="single" w:color="BFBFBF" w:sz="4"/>
@@ -14629,7 +14629,7 @@
         </w:trPr>
         <w:tc>
           <w:tcPr>
-            <w:tcW w:type="dxa" w:w="2619"/>
+            <w:tcW w:type="dxa" w:w="2608"/>
             <w:tcBorders>
               <w:top w:val="single" w:color="BFBFBF" w:sz="4"/>
               <w:left w:val="single" w:color="BFBFBF" w:sz="4"/>
@@ -14655,7 +14655,7 @@
         </w:tc>
         <w:tc>
           <w:tcPr>
-            <w:tcW w:type="dxa" w:w="4944"/>
+            <w:tcW w:type="dxa" w:w="4965"/>
             <w:tcBorders>
               <w:top w:val="single" w:color="BFBFBF" w:sz="4"/>
               <w:left w:val="single" w:color="BFBFBF" w:sz="4"/>
@@ -14681,7 +14681,7 @@
         </w:tc>
         <w:tc>
           <w:tcPr>
-            <w:tcW w:type="dxa" w:w="1797"/>
+            <w:tcW w:type="dxa" w:w="1787"/>
             <w:tcBorders>
               <w:top w:val="single" w:color="BFBFBF" w:sz="4"/>
               <w:left w:val="single" w:color="BFBFBF" w:sz="4"/>
@@ -14713,7 +14713,7 @@
         </w:trPr>
         <w:tc>
           <w:tcPr>
-            <w:tcW w:type="dxa" w:w="2619"/>
+            <w:tcW w:type="dxa" w:w="2608"/>
             <w:tcBorders>
               <w:top w:val="single" w:color="BFBFBF" w:sz="4"/>
               <w:left w:val="single" w:color="BFBFBF" w:sz="4"/>
@@ -14739,7 +14739,7 @@
         </w:tc>
         <w:tc>
           <w:tcPr>
-            <w:tcW w:type="dxa" w:w="4944"/>
+            <w:tcW w:type="dxa" w:w="4965"/>
             <w:tcBorders>
               <w:top w:val="single" w:color="BFBFBF" w:sz="4"/>
               <w:left w:val="single" w:color="BFBFBF" w:sz="4"/>
@@ -14765,7 +14765,7 @@
         </w:tc>
         <w:tc>
           <w:tcPr>
-            <w:tcW w:type="dxa" w:w="1797"/>
+            <w:tcW w:type="dxa" w:w="1787"/>
             <w:tcBorders>
               <w:top w:val="single" w:color="BFBFBF" w:sz="4"/>
               <w:left w:val="single" w:color="BFBFBF" w:sz="4"/>
@@ -14797,7 +14797,7 @@
         </w:trPr>
         <w:tc>
           <w:tcPr>
-            <w:tcW w:type="dxa" w:w="2619"/>
+            <w:tcW w:type="dxa" w:w="2608"/>
             <w:tcBorders>
               <w:top w:val="single" w:color="BFBFBF" w:sz="4"/>
               <w:left w:val="single" w:color="BFBFBF" w:sz="4"/>
@@ -14823,7 +14823,7 @@
         </w:tc>
         <w:tc>
           <w:tcPr>
-            <w:tcW w:type="dxa" w:w="4944"/>
+            <w:tcW w:type="dxa" w:w="4965"/>
             <w:tcBorders>
               <w:top w:val="single" w:color="BFBFBF" w:sz="4"/>
               <w:left w:val="single" w:color="BFBFBF" w:sz="4"/>
@@ -14849,7 +14849,7 @@
         </w:tc>
         <w:tc>
           <w:tcPr>
-            <w:tcW w:type="dxa" w:w="1797"/>
+            <w:tcW w:type="dxa" w:w="1787"/>
             <w:tcBorders>
               <w:top w:val="single" w:color="BFBFBF" w:sz="4"/>
               <w:left w:val="single" w:color="BFBFBF" w:sz="4"/>
@@ -14881,7 +14881,7 @@
         </w:trPr>
         <w:tc>
           <w:tcPr>
-            <w:tcW w:type="dxa" w:w="2619"/>
+            <w:tcW w:type="dxa" w:w="2608"/>
             <w:tcBorders>
               <w:top w:val="single" w:color="BFBFBF" w:sz="4"/>
               <w:left w:val="single" w:color="BFBFBF" w:sz="4"/>
@@ -14907,7 +14907,7 @@
         </w:tc>
         <w:tc>
           <w:tcPr>
-            <w:tcW w:type="dxa" w:w="4944"/>
+            <w:tcW w:type="dxa" w:w="4965"/>
             <w:tcBorders>
               <w:top w:val="single" w:color="BFBFBF" w:sz="4"/>
               <w:left w:val="single" w:color="BFBFBF" w:sz="4"/>
@@ -14933,7 +14933,7 @@
         </w:tc>
         <w:tc>
           <w:tcPr>
-            <w:tcW w:type="dxa" w:w="1797"/>
+            <w:tcW w:type="dxa" w:w="1787"/>
             <w:tcBorders>
               <w:top w:val="single" w:color="BFBFBF" w:sz="4"/>
               <w:left w:val="single" w:color="BFBFBF" w:sz="4"/>
@@ -14965,7 +14965,7 @@
         </w:trPr>
         <w:tc>
           <w:tcPr>
-            <w:tcW w:type="dxa" w:w="2619"/>
+            <w:tcW w:type="dxa" w:w="2608"/>
             <w:tcBorders>
               <w:top w:val="single" w:color="BFBFBF" w:sz="4"/>
               <w:left w:val="single" w:color="BFBFBF" w:sz="4"/>
@@ -14991,7 +14991,7 @@
         </w:tc>
         <w:tc>
           <w:tcPr>
-            <w:tcW w:type="dxa" w:w="4944"/>
+            <w:tcW w:type="dxa" w:w="4965"/>
             <w:tcBorders>
               <w:top w:val="single" w:color="BFBFBF" w:sz="4"/>
               <w:left w:val="single" w:color="BFBFBF" w:sz="4"/>
@@ -15017,7 +15017,7 @@
         </w:tc>
         <w:tc>
           <w:tcPr>
-            <w:tcW w:type="dxa" w:w="1797"/>
+            <w:tcW w:type="dxa" w:w="1787"/>
             <w:tcBorders>
               <w:top w:val="single" w:color="BFBFBF" w:sz="4"/>
               <w:left w:val="single" w:color="BFBFBF" w:sz="4"/>
@@ -15049,7 +15049,7 @@
         </w:trPr>
         <w:tc>
           <w:tcPr>
-            <w:tcW w:type="dxa" w:w="2619"/>
+            <w:tcW w:type="dxa" w:w="2608"/>
             <w:tcBorders>
               <w:top w:val="single" w:color="BFBFBF" w:sz="4"/>
               <w:left w:val="single" w:color="BFBFBF" w:sz="4"/>
@@ -15075,7 +15075,7 @@
         </w:tc>
         <w:tc>
           <w:tcPr>
-            <w:tcW w:type="dxa" w:w="4944"/>
+            <w:tcW w:type="dxa" w:w="4965"/>
             <w:tcBorders>
               <w:top w:val="single" w:color="BFBFBF" w:sz="4"/>
               <w:left w:val="single" w:color="BFBFBF" w:sz="4"/>
@@ -15101,7 +15101,7 @@
         </w:tc>
         <w:tc>
           <w:tcPr>
-            <w:tcW w:type="dxa" w:w="1797"/>
+            <w:tcW w:type="dxa" w:w="1787"/>
             <w:tcBorders>
               <w:top w:val="single" w:color="BFBFBF" w:sz="4"/>
               <w:left w:val="single" w:color="BFBFBF" w:sz="4"/>
@@ -15133,7 +15133,7 @@
         </w:trPr>
         <w:tc>
           <w:tcPr>
-            <w:tcW w:type="dxa" w:w="2619"/>
+            <w:tcW w:type="dxa" w:w="2608"/>
             <w:tcBorders>
               <w:top w:val="single" w:color="BFBFBF" w:sz="4"/>
               <w:left w:val="single" w:color="BFBFBF" w:sz="4"/>
@@ -15159,7 +15159,7 @@
         </w:tc>
         <w:tc>
           <w:tcPr>
-            <w:tcW w:type="dxa" w:w="4944"/>
+            <w:tcW w:type="dxa" w:w="4965"/>
             <w:tcBorders>
               <w:top w:val="single" w:color="BFBFBF" w:sz="4"/>
               <w:left w:val="single" w:color="BFBFBF" w:sz="4"/>
@@ -15185,7 +15185,7 @@
         </w:tc>
         <w:tc>
           <w:tcPr>
-            <w:tcW w:type="dxa" w:w="1797"/>
+            <w:tcW w:type="dxa" w:w="1787"/>
             <w:tcBorders>
               <w:top w:val="single" w:color="BFBFBF" w:sz="4"/>
               <w:left w:val="single" w:color="BFBFBF" w:sz="4"/>
@@ -15217,7 +15217,7 @@
         </w:trPr>
         <w:tc>
           <w:tcPr>
-            <w:tcW w:type="dxa" w:w="2619"/>
+            <w:tcW w:type="dxa" w:w="2608"/>
             <w:tcBorders>
               <w:top w:val="single" w:color="BFBFBF" w:sz="4"/>
               <w:left w:val="single" w:color="BFBFBF" w:sz="4"/>
@@ -15243,7 +15243,7 @@
         </w:tc>
         <w:tc>
           <w:tcPr>
-            <w:tcW w:type="dxa" w:w="4944"/>
+            <w:tcW w:type="dxa" w:w="4965"/>
             <w:tcBorders>
               <w:top w:val="single" w:color="BFBFBF" w:sz="4"/>
               <w:left w:val="single" w:color="BFBFBF" w:sz="4"/>
@@ -15269,7 +15269,7 @@
         </w:tc>
         <w:tc>
           <w:tcPr>
-            <w:tcW w:type="dxa" w:w="1797"/>
+            <w:tcW w:type="dxa" w:w="1787"/>
             <w:tcBorders>
               <w:top w:val="single" w:color="BFBFBF" w:sz="4"/>
               <w:left w:val="single" w:color="BFBFBF" w:sz="4"/>
@@ -15301,7 +15301,7 @@
         </w:trPr>
         <w:tc>
           <w:tcPr>
-            <w:tcW w:type="dxa" w:w="2619"/>
+            <w:tcW w:type="dxa" w:w="2608"/>
             <w:tcBorders>
               <w:top w:val="single" w:color="BFBFBF" w:sz="4"/>
               <w:left w:val="single" w:color="BFBFBF" w:sz="4"/>
@@ -15327,7 +15327,7 @@
         </w:tc>
         <w:tc>
           <w:tcPr>
-            <w:tcW w:type="dxa" w:w="4944"/>
+            <w:tcW w:type="dxa" w:w="4965"/>
             <w:tcBorders>
               <w:top w:val="single" w:color="BFBFBF" w:sz="4"/>
               <w:left w:val="single" w:color="BFBFBF" w:sz="4"/>
@@ -15353,7 +15353,7 @@
         </w:tc>
         <w:tc>
           <w:tcPr>
-            <w:tcW w:type="dxa" w:w="1797"/>
+            <w:tcW w:type="dxa" w:w="1787"/>
             <w:tcBorders>
               <w:top w:val="single" w:color="BFBFBF" w:sz="4"/>
               <w:left w:val="single" w:color="BFBFBF" w:sz="4"/>
@@ -15385,7 +15385,7 @@
         </w:trPr>
         <w:tc>
           <w:tcPr>
-            <w:tcW w:type="dxa" w:w="2619"/>
+            <w:tcW w:type="dxa" w:w="2608"/>
             <w:tcBorders>
               <w:top w:val="single" w:color="BFBFBF" w:sz="4"/>
               <w:left w:val="single" w:color="BFBFBF" w:sz="4"/>
@@ -15411,7 +15411,7 @@
         </w:tc>
         <w:tc>
           <w:tcPr>
-            <w:tcW w:type="dxa" w:w="4944"/>
+            <w:tcW w:type="dxa" w:w="4965"/>
             <w:tcBorders>
               <w:top w:val="single" w:color="BFBFBF" w:sz="4"/>
               <w:left w:val="single" w:color="BFBFBF" w:sz="4"/>
@@ -15437,7 +15437,7 @@
         </w:tc>
         <w:tc>
           <w:tcPr>
-            <w:tcW w:type="dxa" w:w="1797"/>
+            <w:tcW w:type="dxa" w:w="1787"/>
             <w:tcBorders>
               <w:top w:val="single" w:color="BFBFBF" w:sz="4"/>
               <w:left w:val="single" w:color="BFBFBF" w:sz="4"/>
@@ -15469,7 +15469,7 @@
         </w:trPr>
         <w:tc>
           <w:tcPr>
-            <w:tcW w:type="dxa" w:w="2619"/>
+            <w:tcW w:type="dxa" w:w="2608"/>
             <w:tcBorders>
               <w:top w:val="single" w:color="BFBFBF" w:sz="4"/>
               <w:left w:val="single" w:color="BFBFBF" w:sz="4"/>
@@ -15495,7 +15495,7 @@
         </w:tc>
         <w:tc>
           <w:tcPr>
-            <w:tcW w:type="dxa" w:w="4944"/>
+            <w:tcW w:type="dxa" w:w="4965"/>
             <w:tcBorders>
               <w:top w:val="single" w:color="BFBFBF" w:sz="4"/>
               <w:left w:val="single" w:color="BFBFBF" w:sz="4"/>
@@ -15521,7 +15521,7 @@
         </w:tc>
         <w:tc>
           <w:tcPr>
-            <w:tcW w:type="dxa" w:w="1797"/>
+            <w:tcW w:type="dxa" w:w="1787"/>
             <w:tcBorders>
               <w:top w:val="single" w:color="BFBFBF" w:sz="4"/>
               <w:left w:val="single" w:color="BFBFBF" w:sz="4"/>
@@ -15553,7 +15553,7 @@
         </w:trPr>
         <w:tc>
           <w:tcPr>
-            <w:tcW w:type="dxa" w:w="2619"/>
+            <w:tcW w:type="dxa" w:w="2608"/>
             <w:tcBorders>
               <w:top w:val="single" w:color="BFBFBF" w:sz="4"/>
               <w:left w:val="single" w:color="BFBFBF" w:sz="4"/>
@@ -15579,7 +15579,7 @@
         </w:tc>
         <w:tc>
           <w:tcPr>
-            <w:tcW w:type="dxa" w:w="4944"/>
+            <w:tcW w:type="dxa" w:w="4965"/>
             <w:tcBorders>
               <w:top w:val="single" w:color="BFBFBF" w:sz="4"/>
               <w:left w:val="single" w:color="BFBFBF" w:sz="4"/>
@@ -15605,7 +15605,7 @@
         </w:tc>
         <w:tc>
           <w:tcPr>
-            <w:tcW w:type="dxa" w:w="1797"/>
+            <w:tcW w:type="dxa" w:w="1787"/>
             <w:tcBorders>
               <w:top w:val="single" w:color="BFBFBF" w:sz="4"/>
               <w:left w:val="single" w:color="BFBFBF" w:sz="4"/>
@@ -15637,7 +15637,7 @@
         </w:trPr>
         <w:tc>
           <w:tcPr>
-            <w:tcW w:type="dxa" w:w="2619"/>
+            <w:tcW w:type="dxa" w:w="2608"/>
             <w:tcBorders>
               <w:top w:val="single" w:color="BFBFBF" w:sz="4"/>
               <w:left w:val="single" w:color="BFBFBF" w:sz="4"/>
@@ -15663,7 +15663,7 @@
         </w:tc>
         <w:tc>
           <w:tcPr>
-            <w:tcW w:type="dxa" w:w="4944"/>
+            <w:tcW w:type="dxa" w:w="4965"/>
             <w:tcBorders>
               <w:top w:val="single" w:color="BFBFBF" w:sz="4"/>
               <w:left w:val="single" w:color="BFBFBF" w:sz="4"/>
@@ -15689,7 +15689,7 @@
         </w:tc>
         <w:tc>
           <w:tcPr>
-            <w:tcW w:type="dxa" w:w="1797"/>
+            <w:tcW w:type="dxa" w:w="1787"/>
             <w:tcBorders>
               <w:top w:val="single" w:color="BFBFBF" w:sz="4"/>
               <w:left w:val="single" w:color="BFBFBF" w:sz="4"/>
@@ -15721,7 +15721,7 @@
         </w:trPr>
         <w:tc>
           <w:tcPr>
-            <w:tcW w:type="dxa" w:w="2619"/>
+            <w:tcW w:type="dxa" w:w="2608"/>
             <w:tcBorders>
               <w:top w:val="single" w:color="BFBFBF" w:sz="4"/>
               <w:left w:val="single" w:color="BFBFBF" w:sz="4"/>
@@ -15747,7 +15747,7 @@
         </w:tc>
         <w:tc>
           <w:tcPr>
-            <w:tcW w:type="dxa" w:w="4944"/>
+            <w:tcW w:type="dxa" w:w="4965"/>
             <w:tcBorders>
               <w:top w:val="single" w:color="BFBFBF" w:sz="4"/>
               <w:left w:val="single" w:color="BFBFBF" w:sz="4"/>
@@ -15773,7 +15773,7 @@
         </w:tc>
         <w:tc>
           <w:tcPr>
-            <w:tcW w:type="dxa" w:w="1797"/>
+            <w:tcW w:type="dxa" w:w="1787"/>
             <w:tcBorders>
               <w:top w:val="single" w:color="BFBFBF" w:sz="4"/>
               <w:left w:val="single" w:color="BFBFBF" w:sz="4"/>
@@ -15805,7 +15805,7 @@
         </w:trPr>
         <w:tc>
           <w:tcPr>
-            <w:tcW w:type="dxa" w:w="2619"/>
+            <w:tcW w:type="dxa" w:w="2608"/>
             <w:tcBorders>
               <w:top w:val="single" w:color="BFBFBF" w:sz="4"/>
               <w:left w:val="single" w:color="BFBFBF" w:sz="4"/>
@@ -15831,7 +15831,7 @@
         </w:tc>
         <w:tc>
           <w:tcPr>
-            <w:tcW w:type="dxa" w:w="4944"/>
+            <w:tcW w:type="dxa" w:w="4965"/>
             <w:tcBorders>
               <w:top w:val="single" w:color="BFBFBF" w:sz="4"/>
               <w:left w:val="single" w:color="BFBFBF" w:sz="4"/>
@@ -15857,7 +15857,7 @@
         </w:tc>
         <w:tc>
           <w:tcPr>
-            <w:tcW w:type="dxa" w:w="1797"/>
+            <w:tcW w:type="dxa" w:w="1787"/>
             <w:tcBorders>
               <w:top w:val="single" w:color="BFBFBF" w:sz="4"/>
               <w:left w:val="single" w:color="BFBFBF" w:sz="4"/>
@@ -15889,7 +15889,7 @@
         </w:trPr>
         <w:tc>
           <w:tcPr>
-            <w:tcW w:type="dxa" w:w="2619"/>
+            <w:tcW w:type="dxa" w:w="2608"/>
             <w:tcBorders>
               <w:top w:val="single" w:color="BFBFBF" w:sz="4"/>
               <w:left w:val="single" w:color="BFBFBF" w:sz="4"/>
@@ -15915,7 +15915,7 @@
         </w:tc>
         <w:tc>
           <w:tcPr>
-            <w:tcW w:type="dxa" w:w="4944"/>
+            <w:tcW w:type="dxa" w:w="4965"/>
             <w:tcBorders>
               <w:top w:val="single" w:color="BFBFBF" w:sz="4"/>
               <w:left w:val="single" w:color="BFBFBF" w:sz="4"/>
@@ -15941,7 +15941,7 @@
         </w:tc>
         <w:tc>
           <w:tcPr>
-            <w:tcW w:type="dxa" w:w="1797"/>
+            <w:tcW w:type="dxa" w:w="1787"/>
             <w:tcBorders>
               <w:top w:val="single" w:color="BFBFBF" w:sz="4"/>
               <w:left w:val="single" w:color="BFBFBF" w:sz="4"/>
@@ -15973,7 +15973,7 @@
         </w:trPr>
         <w:tc>
           <w:tcPr>
-            <w:tcW w:type="dxa" w:w="2619"/>
+            <w:tcW w:type="dxa" w:w="2608"/>
             <w:tcBorders>
               <w:top w:val="single" w:color="BFBFBF" w:sz="4"/>
               <w:left w:val="single" w:color="BFBFBF" w:sz="4"/>
@@ -15999,7 +15999,7 @@
         </w:tc>
         <w:tc>
           <w:tcPr>
-            <w:tcW w:type="dxa" w:w="4944"/>
+            <w:tcW w:type="dxa" w:w="4965"/>
             <w:tcBorders>
               <w:top w:val="single" w:color="BFBFBF" w:sz="4"/>
               <w:left w:val="single" w:color="BFBFBF" w:sz="4"/>
@@ -16025,7 +16025,7 @@
         </w:tc>
         <w:tc>
           <w:tcPr>
-            <w:tcW w:type="dxa" w:w="1797"/>
+            <w:tcW w:type="dxa" w:w="1787"/>
             <w:tcBorders>
               <w:top w:val="single" w:color="BFBFBF" w:sz="4"/>
               <w:left w:val="single" w:color="BFBFBF" w:sz="4"/>
@@ -16057,7 +16057,7 @@
         </w:trPr>
         <w:tc>
           <w:tcPr>
-            <w:tcW w:type="dxa" w:w="2619"/>
+            <w:tcW w:type="dxa" w:w="2608"/>
             <w:tcBorders>
               <w:top w:val="single" w:color="BFBFBF" w:sz="4"/>
               <w:left w:val="single" w:color="BFBFBF" w:sz="4"/>
@@ -16083,7 +16083,7 @@
         </w:tc>
         <w:tc>
           <w:tcPr>
-            <w:tcW w:type="dxa" w:w="4944"/>
+            <w:tcW w:type="dxa" w:w="4965"/>
             <w:tcBorders>
               <w:top w:val="single" w:color="BFBFBF" w:sz="4"/>
               <w:left w:val="single" w:color="BFBFBF" w:sz="4"/>
@@ -16109,7 +16109,7 @@
         </w:tc>
         <w:tc>
           <w:tcPr>
-            <w:tcW w:type="dxa" w:w="1797"/>
+            <w:tcW w:type="dxa" w:w="1787"/>
             <w:tcBorders>
               <w:top w:val="single" w:color="BFBFBF" w:sz="4"/>
               <w:left w:val="single" w:color="BFBFBF" w:sz="4"/>
@@ -16141,7 +16141,7 @@
         </w:trPr>
         <w:tc>
           <w:tcPr>
-            <w:tcW w:type="dxa" w:w="2619"/>
+            <w:tcW w:type="dxa" w:w="2608"/>
             <w:tcBorders>
               <w:top w:val="single" w:color="BFBFBF" w:sz="4"/>
               <w:left w:val="single" w:color="BFBFBF" w:sz="4"/>
@@ -16167,7 +16167,7 @@
         </w:tc>
         <w:tc>
           <w:tcPr>
-            <w:tcW w:type="dxa" w:w="4944"/>
+            <w:tcW w:type="dxa" w:w="4965"/>
             <w:tcBorders>
               <w:top w:val="single" w:color="BFBFBF" w:sz="4"/>
               <w:left w:val="single" w:color="BFBFBF" w:sz="4"/>
@@ -16193,7 +16193,7 @@
         </w:tc>
         <w:tc>
           <w:tcPr>
-            <w:tcW w:type="dxa" w:w="1797"/>
+            <w:tcW w:type="dxa" w:w="1787"/>
             <w:tcBorders>
               <w:top w:val="single" w:color="BFBFBF" w:sz="4"/>
               <w:left w:val="single" w:color="BFBFBF" w:sz="4"/>
@@ -16225,7 +16225,7 @@
         </w:trPr>
         <w:tc>
           <w:tcPr>
-            <w:tcW w:type="dxa" w:w="2619"/>
+            <w:tcW w:type="dxa" w:w="2608"/>
             <w:tcBorders>
               <w:top w:val="single" w:color="BFBFBF" w:sz="4"/>
               <w:left w:val="single" w:color="BFBFBF" w:sz="4"/>
@@ -16251,33 +16251,33 @@
         </w:tc>
         <w:tc>
           <w:tcPr>
-            <w:tcW w:type="dxa" w:w="4944"/>
-            <w:tcBorders>
-              <w:top w:val="single" w:color="BFBFBF" w:sz="4"/>
-              <w:left w:val="single" w:color="BFBFBF" w:sz="4"/>
-              <w:bottom w:val="single" w:color="BFBFBF" w:sz="4"/>
-              <w:right w:val="single" w:color="BFBFBF" w:sz="4"/>
-            </w:tcBorders>
-            <w:tcMar>
-              <w:top w:type="dxa" w:w="60"/>
-              <w:left w:type="dxa" w:w="100"/>
-              <w:bottom w:type="dxa" w:w="60"/>
-              <w:right w:type="dxa" w:w="100"/>
-            </w:tcMar>
-          </w:tcPr>
-          <w:p>
-            <w:r>
-              <w:rPr>
-                <w:sz w:val="20"/>
-                <w:szCs w:val="20"/>
-              </w:rPr>
-              <w:t xml:space="preserve">Approved</w:t>
-            </w:r>
-          </w:p>
-        </w:tc>
-        <w:tc>
-          <w:tcPr>
-            <w:tcW w:type="dxa" w:w="1797"/>
+            <w:tcW w:type="dxa" w:w="4965"/>
+            <w:tcBorders>
+              <w:top w:val="single" w:color="BFBFBF" w:sz="4"/>
+              <w:left w:val="single" w:color="BFBFBF" w:sz="4"/>
+              <w:bottom w:val="single" w:color="BFBFBF" w:sz="4"/>
+              <w:right w:val="single" w:color="BFBFBF" w:sz="4"/>
+            </w:tcBorders>
+            <w:tcMar>
+              <w:top w:type="dxa" w:w="60"/>
+              <w:left w:type="dxa" w:w="100"/>
+              <w:bottom w:type="dxa" w:w="60"/>
+              <w:right w:type="dxa" w:w="100"/>
+            </w:tcMar>
+          </w:tcPr>
+          <w:p>
+            <w:r>
+              <w:rPr>
+                <w:sz w:val="20"/>
+                <w:szCs w:val="20"/>
+              </w:rPr>
+              <w:t xml:space="preserve">Approved, then replaced by version 5</w:t>
+            </w:r>
+          </w:p>
+        </w:tc>
+        <w:tc>
+          <w:tcPr>
+            <w:tcW w:type="dxa" w:w="1787"/>
             <w:tcBorders>
               <w:top w:val="single" w:color="BFBFBF" w:sz="4"/>
               <w:left w:val="single" w:color="BFBFBF" w:sz="4"/>
@@ -16309,59 +16309,59 @@
         </w:trPr>
         <w:tc>
           <w:tcPr>
-            <w:tcW w:type="dxa" w:w="2619"/>
-            <w:tcBorders>
-              <w:top w:val="single" w:color="BFBFBF" w:sz="4"/>
-              <w:left w:val="single" w:color="BFBFBF" w:sz="4"/>
-              <w:bottom w:val="single" w:color="BFBFBF" w:sz="4"/>
-              <w:right w:val="single" w:color="BFBFBF" w:sz="4"/>
-            </w:tcBorders>
-            <w:tcMar>
-              <w:top w:type="dxa" w:w="60"/>
-              <w:left w:type="dxa" w:w="100"/>
-              <w:bottom w:type="dxa" w:w="60"/>
-              <w:right w:type="dxa" w:w="100"/>
-            </w:tcMar>
-          </w:tcPr>
-          <w:p>
-            <w:r>
-              <w:rPr>
-                <w:sz w:val="20"/>
-                <w:szCs w:val="20"/>
-              </w:rPr>
-              <w:t xml:space="preserve">Cost currency</w:t>
-            </w:r>
-          </w:p>
-        </w:tc>
-        <w:tc>
-          <w:tcPr>
-            <w:tcW w:type="dxa" w:w="4944"/>
-            <w:tcBorders>
-              <w:top w:val="single" w:color="BFBFBF" w:sz="4"/>
-              <w:left w:val="single" w:color="BFBFBF" w:sz="4"/>
-              <w:bottom w:val="single" w:color="BFBFBF" w:sz="4"/>
-              <w:right w:val="single" w:color="BFBFBF" w:sz="4"/>
-            </w:tcBorders>
-            <w:tcMar>
-              <w:top w:type="dxa" w:w="60"/>
-              <w:left w:type="dxa" w:w="100"/>
-              <w:bottom w:type="dxa" w:w="60"/>
-              <w:right w:type="dxa" w:w="100"/>
-            </w:tcMar>
-          </w:tcPr>
-          <w:p>
-            <w:r>
-              <w:rPr>
-                <w:sz w:val="20"/>
-                <w:szCs w:val="20"/>
-              </w:rPr>
-              <w:t xml:space="preserve">Every cost recorded in both US dollars and Indian rupees</w:t>
-            </w:r>
-          </w:p>
-        </w:tc>
-        <w:tc>
-          <w:tcPr>
-            <w:tcW w:type="dxa" w:w="1797"/>
+            <w:tcW w:type="dxa" w:w="2608"/>
+            <w:tcBorders>
+              <w:top w:val="single" w:color="BFBFBF" w:sz="4"/>
+              <w:left w:val="single" w:color="BFBFBF" w:sz="4"/>
+              <w:bottom w:val="single" w:color="BFBFBF" w:sz="4"/>
+              <w:right w:val="single" w:color="BFBFBF" w:sz="4"/>
+            </w:tcBorders>
+            <w:tcMar>
+              <w:top w:type="dxa" w:w="60"/>
+              <w:left w:type="dxa" w:w="100"/>
+              <w:bottom w:type="dxa" w:w="60"/>
+              <w:right w:type="dxa" w:w="100"/>
+            </w:tcMar>
+          </w:tcPr>
+          <w:p>
+            <w:r>
+              <w:rPr>
+                <w:sz w:val="20"/>
+                <w:szCs w:val="20"/>
+              </w:rPr>
+              <w:t xml:space="preserve">Phase 1 spec version 5</w:t>
+            </w:r>
+          </w:p>
+        </w:tc>
+        <w:tc>
+          <w:tcPr>
+            <w:tcW w:type="dxa" w:w="4965"/>
+            <w:tcBorders>
+              <w:top w:val="single" w:color="BFBFBF" w:sz="4"/>
+              <w:left w:val="single" w:color="BFBFBF" w:sz="4"/>
+              <w:bottom w:val="single" w:color="BFBFBF" w:sz="4"/>
+              <w:right w:val="single" w:color="BFBFBF" w:sz="4"/>
+            </w:tcBorders>
+            <w:tcMar>
+              <w:top w:type="dxa" w:w="60"/>
+              <w:left w:type="dxa" w:w="100"/>
+              <w:bottom w:type="dxa" w:w="60"/>
+              <w:right w:type="dxa" w:w="100"/>
+            </w:tcMar>
+          </w:tcPr>
+          <w:p>
+            <w:r>
+              <w:rPr>
+                <w:sz w:val="20"/>
+                <w:szCs w:val="20"/>
+              </w:rPr>
+              <w:t xml:space="preserve">Approved: per-process brand limit, after the queue trial</w:t>
+            </w:r>
+          </w:p>
+        </w:tc>
+        <w:tc>
+          <w:tcPr>
+            <w:tcW w:type="dxa" w:w="1787"/>
             <w:tcBorders>
               <w:top w:val="single" w:color="BFBFBF" w:sz="4"/>
               <w:left w:val="single" w:color="BFBFBF" w:sz="4"/>
@@ -16393,59 +16393,59 @@
         </w:trPr>
         <w:tc>
           <w:tcPr>
-            <w:tcW w:type="dxa" w:w="2619"/>
-            <w:tcBorders>
-              <w:top w:val="single" w:color="BFBFBF" w:sz="4"/>
-              <w:left w:val="single" w:color="BFBFBF" w:sz="4"/>
-              <w:bottom w:val="single" w:color="BFBFBF" w:sz="4"/>
-              <w:right w:val="single" w:color="BFBFBF" w:sz="4"/>
-            </w:tcBorders>
-            <w:tcMar>
-              <w:top w:type="dxa" w:w="60"/>
-              <w:left w:type="dxa" w:w="100"/>
-              <w:bottom w:type="dxa" w:w="60"/>
-              <w:right w:type="dxa" w:w="100"/>
-            </w:tcMar>
-          </w:tcPr>
-          <w:p>
-            <w:r>
-              <w:rPr>
-                <w:sz w:val="20"/>
-                <w:szCs w:val="20"/>
-              </w:rPr>
-              <w:t xml:space="preserve">Retention of job inputs and notifications</w:t>
-            </w:r>
-          </w:p>
-        </w:tc>
-        <w:tc>
-          <w:tcPr>
-            <w:tcW w:type="dxa" w:w="4944"/>
-            <w:tcBorders>
-              <w:top w:val="single" w:color="BFBFBF" w:sz="4"/>
-              <w:left w:val="single" w:color="BFBFBF" w:sz="4"/>
-              <w:bottom w:val="single" w:color="BFBFBF" w:sz="4"/>
-              <w:right w:val="single" w:color="BFBFBF" w:sz="4"/>
-            </w:tcBorders>
-            <w:tcMar>
-              <w:top w:type="dxa" w:w="60"/>
-              <w:left w:type="dxa" w:w="100"/>
-              <w:bottom w:type="dxa" w:w="60"/>
-              <w:right w:type="dxa" w:w="100"/>
-            </w:tcMar>
-          </w:tcPr>
-          <w:p>
-            <w:r>
-              <w:rPr>
-                <w:sz w:val="20"/>
-                <w:szCs w:val="20"/>
-              </w:rPr>
-              <w:t xml:space="preserve">90 days</w:t>
-            </w:r>
-          </w:p>
-        </w:tc>
-        <w:tc>
-          <w:tcPr>
-            <w:tcW w:type="dxa" w:w="1797"/>
+            <w:tcW w:type="dxa" w:w="2608"/>
+            <w:tcBorders>
+              <w:top w:val="single" w:color="BFBFBF" w:sz="4"/>
+              <w:left w:val="single" w:color="BFBFBF" w:sz="4"/>
+              <w:bottom w:val="single" w:color="BFBFBF" w:sz="4"/>
+              <w:right w:val="single" w:color="BFBFBF" w:sz="4"/>
+            </w:tcBorders>
+            <w:tcMar>
+              <w:top w:type="dxa" w:w="60"/>
+              <w:left w:type="dxa" w:w="100"/>
+              <w:bottom w:type="dxa" w:w="60"/>
+              <w:right w:type="dxa" w:w="100"/>
+            </w:tcMar>
+          </w:tcPr>
+          <w:p>
+            <w:r>
+              <w:rPr>
+                <w:sz w:val="20"/>
+                <w:szCs w:val="20"/>
+              </w:rPr>
+              <w:t xml:space="preserve">Cost currency</w:t>
+            </w:r>
+          </w:p>
+        </w:tc>
+        <w:tc>
+          <w:tcPr>
+            <w:tcW w:type="dxa" w:w="4965"/>
+            <w:tcBorders>
+              <w:top w:val="single" w:color="BFBFBF" w:sz="4"/>
+              <w:left w:val="single" w:color="BFBFBF" w:sz="4"/>
+              <w:bottom w:val="single" w:color="BFBFBF" w:sz="4"/>
+              <w:right w:val="single" w:color="BFBFBF" w:sz="4"/>
+            </w:tcBorders>
+            <w:tcMar>
+              <w:top w:type="dxa" w:w="60"/>
+              <w:left w:type="dxa" w:w="100"/>
+              <w:bottom w:type="dxa" w:w="60"/>
+              <w:right w:type="dxa" w:w="100"/>
+            </w:tcMar>
+          </w:tcPr>
+          <w:p>
+            <w:r>
+              <w:rPr>
+                <w:sz w:val="20"/>
+                <w:szCs w:val="20"/>
+              </w:rPr>
+              <w:t xml:space="preserve">Every cost recorded in both US dollars and Indian rupees</w:t>
+            </w:r>
+          </w:p>
+        </w:tc>
+        <w:tc>
+          <w:tcPr>
+            <w:tcW w:type="dxa" w:w="1787"/>
             <w:tcBorders>
               <w:top w:val="single" w:color="BFBFBF" w:sz="4"/>
               <w:left w:val="single" w:color="BFBFBF" w:sz="4"/>
@@ -16477,59 +16477,59 @@
         </w:trPr>
         <w:tc>
           <w:tcPr>
-            <w:tcW w:type="dxa" w:w="2619"/>
-            <w:tcBorders>
-              <w:top w:val="single" w:color="BFBFBF" w:sz="4"/>
-              <w:left w:val="single" w:color="BFBFBF" w:sz="4"/>
-              <w:bottom w:val="single" w:color="BFBFBF" w:sz="4"/>
-              <w:right w:val="single" w:color="BFBFBF" w:sz="4"/>
-            </w:tcBorders>
-            <w:tcMar>
-              <w:top w:type="dxa" w:w="60"/>
-              <w:left w:type="dxa" w:w="100"/>
-              <w:bottom w:type="dxa" w:w="60"/>
-              <w:right w:type="dxa" w:w="100"/>
-            </w:tcMar>
-          </w:tcPr>
-          <w:p>
-            <w:r>
-              <w:rPr>
-                <w:sz w:val="20"/>
-                <w:szCs w:val="20"/>
-              </w:rPr>
-              <w:t xml:space="preserve">Database schema version 2</w:t>
-            </w:r>
-          </w:p>
-        </w:tc>
-        <w:tc>
-          <w:tcPr>
-            <w:tcW w:type="dxa" w:w="4944"/>
-            <w:tcBorders>
-              <w:top w:val="single" w:color="BFBFBF" w:sz="4"/>
-              <w:left w:val="single" w:color="BFBFBF" w:sz="4"/>
-              <w:bottom w:val="single" w:color="BFBFBF" w:sz="4"/>
-              <w:right w:val="single" w:color="BFBFBF" w:sz="4"/>
-            </w:tcBorders>
-            <w:tcMar>
-              <w:top w:type="dxa" w:w="60"/>
-              <w:left w:type="dxa" w:w="100"/>
-              <w:bottom w:type="dxa" w:w="60"/>
-              <w:right w:type="dxa" w:w="100"/>
-            </w:tcMar>
-          </w:tcPr>
-          <w:p>
-            <w:r>
-              <w:rPr>
-                <w:sz w:val="20"/>
-                <w:szCs w:val="20"/>
-              </w:rPr>
-              <w:t xml:space="preserve">Approved. Later-phase tables stay provisional.</w:t>
-            </w:r>
-          </w:p>
-        </w:tc>
-        <w:tc>
-          <w:tcPr>
-            <w:tcW w:type="dxa" w:w="1797"/>
+            <w:tcW w:type="dxa" w:w="2608"/>
+            <w:tcBorders>
+              <w:top w:val="single" w:color="BFBFBF" w:sz="4"/>
+              <w:left w:val="single" w:color="BFBFBF" w:sz="4"/>
+              <w:bottom w:val="single" w:color="BFBFBF" w:sz="4"/>
+              <w:right w:val="single" w:color="BFBFBF" w:sz="4"/>
+            </w:tcBorders>
+            <w:tcMar>
+              <w:top w:type="dxa" w:w="60"/>
+              <w:left w:type="dxa" w:w="100"/>
+              <w:bottom w:type="dxa" w:w="60"/>
+              <w:right w:type="dxa" w:w="100"/>
+            </w:tcMar>
+          </w:tcPr>
+          <w:p>
+            <w:r>
+              <w:rPr>
+                <w:sz w:val="20"/>
+                <w:szCs w:val="20"/>
+              </w:rPr>
+              <w:t xml:space="preserve">Retention of job inputs and notifications</w:t>
+            </w:r>
+          </w:p>
+        </w:tc>
+        <w:tc>
+          <w:tcPr>
+            <w:tcW w:type="dxa" w:w="4965"/>
+            <w:tcBorders>
+              <w:top w:val="single" w:color="BFBFBF" w:sz="4"/>
+              <w:left w:val="single" w:color="BFBFBF" w:sz="4"/>
+              <w:bottom w:val="single" w:color="BFBFBF" w:sz="4"/>
+              <w:right w:val="single" w:color="BFBFBF" w:sz="4"/>
+            </w:tcBorders>
+            <w:tcMar>
+              <w:top w:type="dxa" w:w="60"/>
+              <w:left w:type="dxa" w:w="100"/>
+              <w:bottom w:type="dxa" w:w="60"/>
+              <w:right w:type="dxa" w:w="100"/>
+            </w:tcMar>
+          </w:tcPr>
+          <w:p>
+            <w:r>
+              <w:rPr>
+                <w:sz w:val="20"/>
+                <w:szCs w:val="20"/>
+              </w:rPr>
+              <w:t xml:space="preserve">90 days</w:t>
+            </w:r>
+          </w:p>
+        </w:tc>
+        <w:tc>
+          <w:tcPr>
+            <w:tcW w:type="dxa" w:w="1787"/>
             <w:tcBorders>
               <w:top w:val="single" w:color="BFBFBF" w:sz="4"/>
               <w:left w:val="single" w:color="BFBFBF" w:sz="4"/>
@@ -16561,59 +16561,59 @@
         </w:trPr>
         <w:tc>
           <w:tcPr>
-            <w:tcW w:type="dxa" w:w="2619"/>
-            <w:tcBorders>
-              <w:top w:val="single" w:color="BFBFBF" w:sz="4"/>
-              <w:left w:val="single" w:color="BFBFBF" w:sz="4"/>
-              <w:bottom w:val="single" w:color="BFBFBF" w:sz="4"/>
-              <w:right w:val="single" w:color="BFBFBF" w:sz="4"/>
-            </w:tcBorders>
-            <w:tcMar>
-              <w:top w:type="dxa" w:w="60"/>
-              <w:left w:type="dxa" w:w="100"/>
-              <w:bottom w:type="dxa" w:w="60"/>
-              <w:right w:type="dxa" w:w="100"/>
-            </w:tcMar>
-          </w:tcPr>
-          <w:p>
-            <w:r>
-              <w:rPr>
-                <w:sz w:val="20"/>
-                <w:szCs w:val="20"/>
-              </w:rPr>
-              <w:t xml:space="preserve">Phased implementation plan version 1</w:t>
-            </w:r>
-          </w:p>
-        </w:tc>
-        <w:tc>
-          <w:tcPr>
-            <w:tcW w:type="dxa" w:w="4944"/>
-            <w:tcBorders>
-              <w:top w:val="single" w:color="BFBFBF" w:sz="4"/>
-              <w:left w:val="single" w:color="BFBFBF" w:sz="4"/>
-              <w:bottom w:val="single" w:color="BFBFBF" w:sz="4"/>
-              <w:right w:val="single" w:color="BFBFBF" w:sz="4"/>
-            </w:tcBorders>
-            <w:tcMar>
-              <w:top w:type="dxa" w:w="60"/>
-              <w:left w:type="dxa" w:w="100"/>
-              <w:bottom w:type="dxa" w:w="60"/>
-              <w:right w:type="dxa" w:w="100"/>
-            </w:tcMar>
-          </w:tcPr>
-          <w:p>
-            <w:r>
-              <w:rPr>
-                <w:sz w:val="20"/>
-                <w:szCs w:val="20"/>
-              </w:rPr>
-              <w:t xml:space="preserve">Approved, with its assumption that Claude Code builds and the owner reviews</w:t>
-            </w:r>
-          </w:p>
-        </w:tc>
-        <w:tc>
-          <w:tcPr>
-            <w:tcW w:type="dxa" w:w="1797"/>
+            <w:tcW w:type="dxa" w:w="2608"/>
+            <w:tcBorders>
+              <w:top w:val="single" w:color="BFBFBF" w:sz="4"/>
+              <w:left w:val="single" w:color="BFBFBF" w:sz="4"/>
+              <w:bottom w:val="single" w:color="BFBFBF" w:sz="4"/>
+              <w:right w:val="single" w:color="BFBFBF" w:sz="4"/>
+            </w:tcBorders>
+            <w:tcMar>
+              <w:top w:type="dxa" w:w="60"/>
+              <w:left w:type="dxa" w:w="100"/>
+              <w:bottom w:type="dxa" w:w="60"/>
+              <w:right w:type="dxa" w:w="100"/>
+            </w:tcMar>
+          </w:tcPr>
+          <w:p>
+            <w:r>
+              <w:rPr>
+                <w:sz w:val="20"/>
+                <w:szCs w:val="20"/>
+              </w:rPr>
+              <w:t xml:space="preserve">Database schema version 2</w:t>
+            </w:r>
+          </w:p>
+        </w:tc>
+        <w:tc>
+          <w:tcPr>
+            <w:tcW w:type="dxa" w:w="4965"/>
+            <w:tcBorders>
+              <w:top w:val="single" w:color="BFBFBF" w:sz="4"/>
+              <w:left w:val="single" w:color="BFBFBF" w:sz="4"/>
+              <w:bottom w:val="single" w:color="BFBFBF" w:sz="4"/>
+              <w:right w:val="single" w:color="BFBFBF" w:sz="4"/>
+            </w:tcBorders>
+            <w:tcMar>
+              <w:top w:type="dxa" w:w="60"/>
+              <w:left w:type="dxa" w:w="100"/>
+              <w:bottom w:type="dxa" w:w="60"/>
+              <w:right w:type="dxa" w:w="100"/>
+            </w:tcMar>
+          </w:tcPr>
+          <w:p>
+            <w:r>
+              <w:rPr>
+                <w:sz w:val="20"/>
+                <w:szCs w:val="20"/>
+              </w:rPr>
+              <w:t xml:space="preserve">Approved. Later-phase tables stay provisional.</w:t>
+            </w:r>
+          </w:p>
+        </w:tc>
+        <w:tc>
+          <w:tcPr>
+            <w:tcW w:type="dxa" w:w="1787"/>
             <w:tcBorders>
               <w:top w:val="single" w:color="BFBFBF" w:sz="4"/>
               <w:left w:val="single" w:color="BFBFBF" w:sz="4"/>
@@ -16645,59 +16645,59 @@
         </w:trPr>
         <w:tc>
           <w:tcPr>
-            <w:tcW w:type="dxa" w:w="2619"/>
-            <w:tcBorders>
-              <w:top w:val="single" w:color="BFBFBF" w:sz="4"/>
-              <w:left w:val="single" w:color="BFBFBF" w:sz="4"/>
-              <w:bottom w:val="single" w:color="BFBFBF" w:sz="4"/>
-              <w:right w:val="single" w:color="BFBFBF" w:sz="4"/>
-            </w:tcBorders>
-            <w:tcMar>
-              <w:top w:type="dxa" w:w="60"/>
-              <w:left w:type="dxa" w:w="100"/>
-              <w:bottom w:type="dxa" w:w="60"/>
-              <w:right w:type="dxa" w:w="100"/>
-            </w:tcMar>
-          </w:tcPr>
-          <w:p>
-            <w:r>
-              <w:rPr>
-                <w:sz w:val="20"/>
-                <w:szCs w:val="20"/>
-              </w:rPr>
-              <w:t xml:space="preserve">Permission to commit (A8)</w:t>
-            </w:r>
-          </w:p>
-        </w:tc>
-        <w:tc>
-          <w:tcPr>
-            <w:tcW w:type="dxa" w:w="4944"/>
-            <w:tcBorders>
-              <w:top w:val="single" w:color="BFBFBF" w:sz="4"/>
-              <w:left w:val="single" w:color="BFBFBF" w:sz="4"/>
-              <w:bottom w:val="single" w:color="BFBFBF" w:sz="4"/>
-              <w:right w:val="single" w:color="BFBFBF" w:sz="4"/>
-            </w:tcBorders>
-            <w:tcMar>
-              <w:top w:type="dxa" w:w="60"/>
-              <w:left w:type="dxa" w:w="100"/>
-              <w:bottom w:type="dxa" w:w="60"/>
-              <w:right w:type="dxa" w:w="100"/>
-            </w:tcMar>
-          </w:tcPr>
-          <w:p>
-            <w:r>
-              <w:rPr>
-                <w:sz w:val="20"/>
-                <w:szCs w:val="20"/>
-              </w:rPr>
-              <w:t xml:space="preserve">Yes</w:t>
-            </w:r>
-          </w:p>
-        </w:tc>
-        <w:tc>
-          <w:tcPr>
-            <w:tcW w:type="dxa" w:w="1797"/>
+            <w:tcW w:type="dxa" w:w="2608"/>
+            <w:tcBorders>
+              <w:top w:val="single" w:color="BFBFBF" w:sz="4"/>
+              <w:left w:val="single" w:color="BFBFBF" w:sz="4"/>
+              <w:bottom w:val="single" w:color="BFBFBF" w:sz="4"/>
+              <w:right w:val="single" w:color="BFBFBF" w:sz="4"/>
+            </w:tcBorders>
+            <w:tcMar>
+              <w:top w:type="dxa" w:w="60"/>
+              <w:left w:type="dxa" w:w="100"/>
+              <w:bottom w:type="dxa" w:w="60"/>
+              <w:right w:type="dxa" w:w="100"/>
+            </w:tcMar>
+          </w:tcPr>
+          <w:p>
+            <w:r>
+              <w:rPr>
+                <w:sz w:val="20"/>
+                <w:szCs w:val="20"/>
+              </w:rPr>
+              <w:t xml:space="preserve">Phased implementation plan version 1</w:t>
+            </w:r>
+          </w:p>
+        </w:tc>
+        <w:tc>
+          <w:tcPr>
+            <w:tcW w:type="dxa" w:w="4965"/>
+            <w:tcBorders>
+              <w:top w:val="single" w:color="BFBFBF" w:sz="4"/>
+              <w:left w:val="single" w:color="BFBFBF" w:sz="4"/>
+              <w:bottom w:val="single" w:color="BFBFBF" w:sz="4"/>
+              <w:right w:val="single" w:color="BFBFBF" w:sz="4"/>
+            </w:tcBorders>
+            <w:tcMar>
+              <w:top w:type="dxa" w:w="60"/>
+              <w:left w:type="dxa" w:w="100"/>
+              <w:bottom w:type="dxa" w:w="60"/>
+              <w:right w:type="dxa" w:w="100"/>
+            </w:tcMar>
+          </w:tcPr>
+          <w:p>
+            <w:r>
+              <w:rPr>
+                <w:sz w:val="20"/>
+                <w:szCs w:val="20"/>
+              </w:rPr>
+              <w:t xml:space="preserve">Approved, with its assumption that Claude Code builds and the owner reviews</w:t>
+            </w:r>
+          </w:p>
+        </w:tc>
+        <w:tc>
+          <w:tcPr>
+            <w:tcW w:type="dxa" w:w="1787"/>
             <w:tcBorders>
               <w:top w:val="single" w:color="BFBFBF" w:sz="4"/>
               <w:left w:val="single" w:color="BFBFBF" w:sz="4"/>
@@ -16729,7 +16729,91 @@
         </w:trPr>
         <w:tc>
           <w:tcPr>
-            <w:tcW w:type="dxa" w:w="2619"/>
+            <w:tcW w:type="dxa" w:w="2608"/>
+            <w:tcBorders>
+              <w:top w:val="single" w:color="BFBFBF" w:sz="4"/>
+              <w:left w:val="single" w:color="BFBFBF" w:sz="4"/>
+              <w:bottom w:val="single" w:color="BFBFBF" w:sz="4"/>
+              <w:right w:val="single" w:color="BFBFBF" w:sz="4"/>
+            </w:tcBorders>
+            <w:tcMar>
+              <w:top w:type="dxa" w:w="60"/>
+              <w:left w:type="dxa" w:w="100"/>
+              <w:bottom w:type="dxa" w:w="60"/>
+              <w:right w:type="dxa" w:w="100"/>
+            </w:tcMar>
+          </w:tcPr>
+          <w:p>
+            <w:r>
+              <w:rPr>
+                <w:sz w:val="20"/>
+                <w:szCs w:val="20"/>
+              </w:rPr>
+              <w:t xml:space="preserve">Permission to commit (A8)</w:t>
+            </w:r>
+          </w:p>
+        </w:tc>
+        <w:tc>
+          <w:tcPr>
+            <w:tcW w:type="dxa" w:w="4965"/>
+            <w:tcBorders>
+              <w:top w:val="single" w:color="BFBFBF" w:sz="4"/>
+              <w:left w:val="single" w:color="BFBFBF" w:sz="4"/>
+              <w:bottom w:val="single" w:color="BFBFBF" w:sz="4"/>
+              <w:right w:val="single" w:color="BFBFBF" w:sz="4"/>
+            </w:tcBorders>
+            <w:tcMar>
+              <w:top w:type="dxa" w:w="60"/>
+              <w:left w:type="dxa" w:w="100"/>
+              <w:bottom w:type="dxa" w:w="60"/>
+              <w:right w:type="dxa" w:w="100"/>
+            </w:tcMar>
+          </w:tcPr>
+          <w:p>
+            <w:r>
+              <w:rPr>
+                <w:sz w:val="20"/>
+                <w:szCs w:val="20"/>
+              </w:rPr>
+              <w:t xml:space="preserve">Yes</w:t>
+            </w:r>
+          </w:p>
+        </w:tc>
+        <w:tc>
+          <w:tcPr>
+            <w:tcW w:type="dxa" w:w="1787"/>
+            <w:tcBorders>
+              <w:top w:val="single" w:color="BFBFBF" w:sz="4"/>
+              <w:left w:val="single" w:color="BFBFBF" w:sz="4"/>
+              <w:bottom w:val="single" w:color="BFBFBF" w:sz="4"/>
+              <w:right w:val="single" w:color="BFBFBF" w:sz="4"/>
+            </w:tcBorders>
+            <w:tcMar>
+              <w:top w:type="dxa" w:w="60"/>
+              <w:left w:type="dxa" w:w="100"/>
+              <w:bottom w:type="dxa" w:w="60"/>
+              <w:right w:type="dxa" w:w="100"/>
+            </w:tcMar>
+          </w:tcPr>
+          <w:p>
+            <w:r>
+              <w:rPr>
+                <w:sz w:val="20"/>
+                <w:szCs w:val="20"/>
+              </w:rPr>
+              <w:t xml:space="preserve">2026-10-04</w:t>
+            </w:r>
+          </w:p>
+        </w:tc>
+      </w:tr>
+      <w:tr>
+        <w:trPr>
+          <w:cantSplit/>
+          <w:tblHeader w:val="off"/>
+        </w:trPr>
+        <w:tc>
+          <w:tcPr>
+            <w:tcW w:type="dxa" w:w="2608"/>
             <w:tcBorders>
               <w:top w:val="single" w:color="BFBFBF" w:sz="4"/>
               <w:left w:val="single" w:color="BFBFBF" w:sz="4"/>
@@ -16755,7 +16839,7 @@
         </w:tc>
         <w:tc>
           <w:tcPr>
-            <w:tcW w:type="dxa" w:w="4944"/>
+            <w:tcW w:type="dxa" w:w="4965"/>
             <w:tcBorders>
               <w:top w:val="single" w:color="BFBFBF" w:sz="4"/>
               <w:left w:val="single" w:color="BFBFBF" w:sz="4"/>
@@ -16790,7 +16874,7 @@
         </w:tc>
         <w:tc>
           <w:tcPr>
-            <w:tcW w:type="dxa" w:w="1797"/>
+            <w:tcW w:type="dxa" w:w="1787"/>
             <w:tcBorders>
               <w:top w:val="single" w:color="BFBFBF" w:sz="4"/>
               <w:left w:val="single" w:color="BFBFBF" w:sz="4"/>

</xml_diff>

<commit_message>
docs: Tech stack v2 - ESLint 10.10.0 replaces unsupported 9.39.5
Approved by the owner on 2026-10-04. Phase 1 spec section 3 copies the
new version.

Co-Authored-By: Claude Opus 5.5 <noreply@anthropic.com>
Claude-Session: https://claude.ai/code/session_01KxscWn9fSBZzY3BEJFGfy4
</commit_message>
<xml_diff>
--- a/docs/sachin-to-provide.docx
+++ b/docs/sachin-to-provide.docx
@@ -13853,9 +13853,9 @@
         </w:tblBorders>
       </w:tblPr>
       <w:tblGrid>
-        <w:gridCol w:w="2608"/>
-        <w:gridCol w:w="4965"/>
-        <w:gridCol w:w="1787"/>
+        <w:gridCol w:w="2604"/>
+        <w:gridCol w:w="4973"/>
+        <w:gridCol w:w="1783"/>
       </w:tblGrid>
       <w:tr>
         <w:trPr>
@@ -13864,7 +13864,7 @@
         </w:trPr>
         <w:tc>
           <w:tcPr>
-            <w:tcW w:type="dxa" w:w="2608"/>
+            <w:tcW w:type="dxa" w:w="2604"/>
             <w:tcBorders>
               <w:top w:val="single" w:color="BFBFBF" w:sz="4"/>
               <w:left w:val="single" w:color="BFBFBF" w:sz="4"/>
@@ -13893,7 +13893,7 @@
         </w:tc>
         <w:tc>
           <w:tcPr>
-            <w:tcW w:type="dxa" w:w="4965"/>
+            <w:tcW w:type="dxa" w:w="4973"/>
             <w:tcBorders>
               <w:top w:val="single" w:color="BFBFBF" w:sz="4"/>
               <w:left w:val="single" w:color="BFBFBF" w:sz="4"/>
@@ -13922,7 +13922,7 @@
         </w:tc>
         <w:tc>
           <w:tcPr>
-            <w:tcW w:type="dxa" w:w="1787"/>
+            <w:tcW w:type="dxa" w:w="1783"/>
             <w:tcBorders>
               <w:top w:val="single" w:color="BFBFBF" w:sz="4"/>
               <w:left w:val="single" w:color="BFBFBF" w:sz="4"/>
@@ -13957,7 +13957,7 @@
         </w:trPr>
         <w:tc>
           <w:tcPr>
-            <w:tcW w:type="dxa" w:w="2608"/>
+            <w:tcW w:type="dxa" w:w="2604"/>
             <w:tcBorders>
               <w:top w:val="single" w:color="BFBFBF" w:sz="4"/>
               <w:left w:val="single" w:color="BFBFBF" w:sz="4"/>
@@ -13983,7 +13983,7 @@
         </w:tc>
         <w:tc>
           <w:tcPr>
-            <w:tcW w:type="dxa" w:w="4965"/>
+            <w:tcW w:type="dxa" w:w="4973"/>
             <w:tcBorders>
               <w:top w:val="single" w:color="BFBFBF" w:sz="4"/>
               <w:left w:val="single" w:color="BFBFBF" w:sz="4"/>
@@ -14009,7 +14009,7 @@
         </w:tc>
         <w:tc>
           <w:tcPr>
-            <w:tcW w:type="dxa" w:w="1787"/>
+            <w:tcW w:type="dxa" w:w="1783"/>
             <w:tcBorders>
               <w:top w:val="single" w:color="BFBFBF" w:sz="4"/>
               <w:left w:val="single" w:color="BFBFBF" w:sz="4"/>
@@ -14041,7 +14041,7 @@
         </w:trPr>
         <w:tc>
           <w:tcPr>
-            <w:tcW w:type="dxa" w:w="2608"/>
+            <w:tcW w:type="dxa" w:w="2604"/>
             <w:tcBorders>
               <w:top w:val="single" w:color="BFBFBF" w:sz="4"/>
               <w:left w:val="single" w:color="BFBFBF" w:sz="4"/>
@@ -14067,7 +14067,7 @@
         </w:tc>
         <w:tc>
           <w:tcPr>
-            <w:tcW w:type="dxa" w:w="4965"/>
+            <w:tcW w:type="dxa" w:w="4973"/>
             <w:tcBorders>
               <w:top w:val="single" w:color="BFBFBF" w:sz="4"/>
               <w:left w:val="single" w:color="BFBFBF" w:sz="4"/>
@@ -14093,7 +14093,7 @@
         </w:tc>
         <w:tc>
           <w:tcPr>
-            <w:tcW w:type="dxa" w:w="1787"/>
+            <w:tcW w:type="dxa" w:w="1783"/>
             <w:tcBorders>
               <w:top w:val="single" w:color="BFBFBF" w:sz="4"/>
               <w:left w:val="single" w:color="BFBFBF" w:sz="4"/>
@@ -14125,7 +14125,7 @@
         </w:trPr>
         <w:tc>
           <w:tcPr>
-            <w:tcW w:type="dxa" w:w="2608"/>
+            <w:tcW w:type="dxa" w:w="2604"/>
             <w:tcBorders>
               <w:top w:val="single" w:color="BFBFBF" w:sz="4"/>
               <w:left w:val="single" w:color="BFBFBF" w:sz="4"/>
@@ -14151,7 +14151,7 @@
         </w:tc>
         <w:tc>
           <w:tcPr>
-            <w:tcW w:type="dxa" w:w="4965"/>
+            <w:tcW w:type="dxa" w:w="4973"/>
             <w:tcBorders>
               <w:top w:val="single" w:color="BFBFBF" w:sz="4"/>
               <w:left w:val="single" w:color="BFBFBF" w:sz="4"/>
@@ -14177,7 +14177,7 @@
         </w:tc>
         <w:tc>
           <w:tcPr>
-            <w:tcW w:type="dxa" w:w="1787"/>
+            <w:tcW w:type="dxa" w:w="1783"/>
             <w:tcBorders>
               <w:top w:val="single" w:color="BFBFBF" w:sz="4"/>
               <w:left w:val="single" w:color="BFBFBF" w:sz="4"/>
@@ -14209,7 +14209,7 @@
         </w:trPr>
         <w:tc>
           <w:tcPr>
-            <w:tcW w:type="dxa" w:w="2608"/>
+            <w:tcW w:type="dxa" w:w="2604"/>
             <w:tcBorders>
               <w:top w:val="single" w:color="BFBFBF" w:sz="4"/>
               <w:left w:val="single" w:color="BFBFBF" w:sz="4"/>
@@ -14235,7 +14235,7 @@
         </w:tc>
         <w:tc>
           <w:tcPr>
-            <w:tcW w:type="dxa" w:w="4965"/>
+            <w:tcW w:type="dxa" w:w="4973"/>
             <w:tcBorders>
               <w:top w:val="single" w:color="BFBFBF" w:sz="4"/>
               <w:left w:val="single" w:color="BFBFBF" w:sz="4"/>
@@ -14261,7 +14261,7 @@
         </w:tc>
         <w:tc>
           <w:tcPr>
-            <w:tcW w:type="dxa" w:w="1787"/>
+            <w:tcW w:type="dxa" w:w="1783"/>
             <w:tcBorders>
               <w:top w:val="single" w:color="BFBFBF" w:sz="4"/>
               <w:left w:val="single" w:color="BFBFBF" w:sz="4"/>
@@ -14293,7 +14293,7 @@
         </w:trPr>
         <w:tc>
           <w:tcPr>
-            <w:tcW w:type="dxa" w:w="2608"/>
+            <w:tcW w:type="dxa" w:w="2604"/>
             <w:tcBorders>
               <w:top w:val="single" w:color="BFBFBF" w:sz="4"/>
               <w:left w:val="single" w:color="BFBFBF" w:sz="4"/>
@@ -14319,7 +14319,7 @@
         </w:tc>
         <w:tc>
           <w:tcPr>
-            <w:tcW w:type="dxa" w:w="4965"/>
+            <w:tcW w:type="dxa" w:w="4973"/>
             <w:tcBorders>
               <w:top w:val="single" w:color="BFBFBF" w:sz="4"/>
               <w:left w:val="single" w:color="BFBFBF" w:sz="4"/>
@@ -14345,7 +14345,7 @@
         </w:tc>
         <w:tc>
           <w:tcPr>
-            <w:tcW w:type="dxa" w:w="1787"/>
+            <w:tcW w:type="dxa" w:w="1783"/>
             <w:tcBorders>
               <w:top w:val="single" w:color="BFBFBF" w:sz="4"/>
               <w:left w:val="single" w:color="BFBFBF" w:sz="4"/>
@@ -14377,7 +14377,7 @@
         </w:trPr>
         <w:tc>
           <w:tcPr>
-            <w:tcW w:type="dxa" w:w="2608"/>
+            <w:tcW w:type="dxa" w:w="2604"/>
             <w:tcBorders>
               <w:top w:val="single" w:color="BFBFBF" w:sz="4"/>
               <w:left w:val="single" w:color="BFBFBF" w:sz="4"/>
@@ -14403,7 +14403,7 @@
         </w:tc>
         <w:tc>
           <w:tcPr>
-            <w:tcW w:type="dxa" w:w="4965"/>
+            <w:tcW w:type="dxa" w:w="4973"/>
             <w:tcBorders>
               <w:top w:val="single" w:color="BFBFBF" w:sz="4"/>
               <w:left w:val="single" w:color="BFBFBF" w:sz="4"/>
@@ -14429,7 +14429,7 @@
         </w:tc>
         <w:tc>
           <w:tcPr>
-            <w:tcW w:type="dxa" w:w="1787"/>
+            <w:tcW w:type="dxa" w:w="1783"/>
             <w:tcBorders>
               <w:top w:val="single" w:color="BFBFBF" w:sz="4"/>
               <w:left w:val="single" w:color="BFBFBF" w:sz="4"/>
@@ -14461,7 +14461,7 @@
         </w:trPr>
         <w:tc>
           <w:tcPr>
-            <w:tcW w:type="dxa" w:w="2608"/>
+            <w:tcW w:type="dxa" w:w="2604"/>
             <w:tcBorders>
               <w:top w:val="single" w:color="BFBFBF" w:sz="4"/>
               <w:left w:val="single" w:color="BFBFBF" w:sz="4"/>
@@ -14487,7 +14487,7 @@
         </w:tc>
         <w:tc>
           <w:tcPr>
-            <w:tcW w:type="dxa" w:w="4965"/>
+            <w:tcW w:type="dxa" w:w="4973"/>
             <w:tcBorders>
               <w:top w:val="single" w:color="BFBFBF" w:sz="4"/>
               <w:left w:val="single" w:color="BFBFBF" w:sz="4"/>
@@ -14513,7 +14513,7 @@
         </w:tc>
         <w:tc>
           <w:tcPr>
-            <w:tcW w:type="dxa" w:w="1787"/>
+            <w:tcW w:type="dxa" w:w="1783"/>
             <w:tcBorders>
               <w:top w:val="single" w:color="BFBFBF" w:sz="4"/>
               <w:left w:val="single" w:color="BFBFBF" w:sz="4"/>
@@ -14545,7 +14545,7 @@
         </w:trPr>
         <w:tc>
           <w:tcPr>
-            <w:tcW w:type="dxa" w:w="2608"/>
+            <w:tcW w:type="dxa" w:w="2604"/>
             <w:tcBorders>
               <w:top w:val="single" w:color="BFBFBF" w:sz="4"/>
               <w:left w:val="single" w:color="BFBFBF" w:sz="4"/>
@@ -14571,7 +14571,7 @@
         </w:tc>
         <w:tc>
           <w:tcPr>
-            <w:tcW w:type="dxa" w:w="4965"/>
+            <w:tcW w:type="dxa" w:w="4973"/>
             <w:tcBorders>
               <w:top w:val="single" w:color="BFBFBF" w:sz="4"/>
               <w:left w:val="single" w:color="BFBFBF" w:sz="4"/>
@@ -14597,7 +14597,7 @@
         </w:tc>
         <w:tc>
           <w:tcPr>
-            <w:tcW w:type="dxa" w:w="1787"/>
+            <w:tcW w:type="dxa" w:w="1783"/>
             <w:tcBorders>
               <w:top w:val="single" w:color="BFBFBF" w:sz="4"/>
               <w:left w:val="single" w:color="BFBFBF" w:sz="4"/>
@@ -14629,7 +14629,7 @@
         </w:trPr>
         <w:tc>
           <w:tcPr>
-            <w:tcW w:type="dxa" w:w="2608"/>
+            <w:tcW w:type="dxa" w:w="2604"/>
             <w:tcBorders>
               <w:top w:val="single" w:color="BFBFBF" w:sz="4"/>
               <w:left w:val="single" w:color="BFBFBF" w:sz="4"/>
@@ -14655,7 +14655,7 @@
         </w:tc>
         <w:tc>
           <w:tcPr>
-            <w:tcW w:type="dxa" w:w="4965"/>
+            <w:tcW w:type="dxa" w:w="4973"/>
             <w:tcBorders>
               <w:top w:val="single" w:color="BFBFBF" w:sz="4"/>
               <w:left w:val="single" w:color="BFBFBF" w:sz="4"/>
@@ -14681,7 +14681,7 @@
         </w:tc>
         <w:tc>
           <w:tcPr>
-            <w:tcW w:type="dxa" w:w="1787"/>
+            <w:tcW w:type="dxa" w:w="1783"/>
             <w:tcBorders>
               <w:top w:val="single" w:color="BFBFBF" w:sz="4"/>
               <w:left w:val="single" w:color="BFBFBF" w:sz="4"/>
@@ -14713,7 +14713,7 @@
         </w:trPr>
         <w:tc>
           <w:tcPr>
-            <w:tcW w:type="dxa" w:w="2608"/>
+            <w:tcW w:type="dxa" w:w="2604"/>
             <w:tcBorders>
               <w:top w:val="single" w:color="BFBFBF" w:sz="4"/>
               <w:left w:val="single" w:color="BFBFBF" w:sz="4"/>
@@ -14739,7 +14739,7 @@
         </w:tc>
         <w:tc>
           <w:tcPr>
-            <w:tcW w:type="dxa" w:w="4965"/>
+            <w:tcW w:type="dxa" w:w="4973"/>
             <w:tcBorders>
               <w:top w:val="single" w:color="BFBFBF" w:sz="4"/>
               <w:left w:val="single" w:color="BFBFBF" w:sz="4"/>
@@ -14765,7 +14765,7 @@
         </w:tc>
         <w:tc>
           <w:tcPr>
-            <w:tcW w:type="dxa" w:w="1787"/>
+            <w:tcW w:type="dxa" w:w="1783"/>
             <w:tcBorders>
               <w:top w:val="single" w:color="BFBFBF" w:sz="4"/>
               <w:left w:val="single" w:color="BFBFBF" w:sz="4"/>
@@ -14797,7 +14797,7 @@
         </w:trPr>
         <w:tc>
           <w:tcPr>
-            <w:tcW w:type="dxa" w:w="2608"/>
+            <w:tcW w:type="dxa" w:w="2604"/>
             <w:tcBorders>
               <w:top w:val="single" w:color="BFBFBF" w:sz="4"/>
               <w:left w:val="single" w:color="BFBFBF" w:sz="4"/>
@@ -14823,7 +14823,7 @@
         </w:tc>
         <w:tc>
           <w:tcPr>
-            <w:tcW w:type="dxa" w:w="4965"/>
+            <w:tcW w:type="dxa" w:w="4973"/>
             <w:tcBorders>
               <w:top w:val="single" w:color="BFBFBF" w:sz="4"/>
               <w:left w:val="single" w:color="BFBFBF" w:sz="4"/>
@@ -14849,7 +14849,7 @@
         </w:tc>
         <w:tc>
           <w:tcPr>
-            <w:tcW w:type="dxa" w:w="1787"/>
+            <w:tcW w:type="dxa" w:w="1783"/>
             <w:tcBorders>
               <w:top w:val="single" w:color="BFBFBF" w:sz="4"/>
               <w:left w:val="single" w:color="BFBFBF" w:sz="4"/>
@@ -14881,7 +14881,7 @@
         </w:trPr>
         <w:tc>
           <w:tcPr>
-            <w:tcW w:type="dxa" w:w="2608"/>
+            <w:tcW w:type="dxa" w:w="2604"/>
             <w:tcBorders>
               <w:top w:val="single" w:color="BFBFBF" w:sz="4"/>
               <w:left w:val="single" w:color="BFBFBF" w:sz="4"/>
@@ -14907,7 +14907,7 @@
         </w:tc>
         <w:tc>
           <w:tcPr>
-            <w:tcW w:type="dxa" w:w="4965"/>
+            <w:tcW w:type="dxa" w:w="4973"/>
             <w:tcBorders>
               <w:top w:val="single" w:color="BFBFBF" w:sz="4"/>
               <w:left w:val="single" w:color="BFBFBF" w:sz="4"/>
@@ -14933,7 +14933,7 @@
         </w:tc>
         <w:tc>
           <w:tcPr>
-            <w:tcW w:type="dxa" w:w="1787"/>
+            <w:tcW w:type="dxa" w:w="1783"/>
             <w:tcBorders>
               <w:top w:val="single" w:color="BFBFBF" w:sz="4"/>
               <w:left w:val="single" w:color="BFBFBF" w:sz="4"/>
@@ -14965,7 +14965,7 @@
         </w:trPr>
         <w:tc>
           <w:tcPr>
-            <w:tcW w:type="dxa" w:w="2608"/>
+            <w:tcW w:type="dxa" w:w="2604"/>
             <w:tcBorders>
               <w:top w:val="single" w:color="BFBFBF" w:sz="4"/>
               <w:left w:val="single" w:color="BFBFBF" w:sz="4"/>
@@ -14991,7 +14991,7 @@
         </w:tc>
         <w:tc>
           <w:tcPr>
-            <w:tcW w:type="dxa" w:w="4965"/>
+            <w:tcW w:type="dxa" w:w="4973"/>
             <w:tcBorders>
               <w:top w:val="single" w:color="BFBFBF" w:sz="4"/>
               <w:left w:val="single" w:color="BFBFBF" w:sz="4"/>
@@ -15017,7 +15017,7 @@
         </w:tc>
         <w:tc>
           <w:tcPr>
-            <w:tcW w:type="dxa" w:w="1787"/>
+            <w:tcW w:type="dxa" w:w="1783"/>
             <w:tcBorders>
               <w:top w:val="single" w:color="BFBFBF" w:sz="4"/>
               <w:left w:val="single" w:color="BFBFBF" w:sz="4"/>
@@ -15049,7 +15049,7 @@
         </w:trPr>
         <w:tc>
           <w:tcPr>
-            <w:tcW w:type="dxa" w:w="2608"/>
+            <w:tcW w:type="dxa" w:w="2604"/>
             <w:tcBorders>
               <w:top w:val="single" w:color="BFBFBF" w:sz="4"/>
               <w:left w:val="single" w:color="BFBFBF" w:sz="4"/>
@@ -15075,7 +15075,7 @@
         </w:tc>
         <w:tc>
           <w:tcPr>
-            <w:tcW w:type="dxa" w:w="4965"/>
+            <w:tcW w:type="dxa" w:w="4973"/>
             <w:tcBorders>
               <w:top w:val="single" w:color="BFBFBF" w:sz="4"/>
               <w:left w:val="single" w:color="BFBFBF" w:sz="4"/>
@@ -15101,7 +15101,7 @@
         </w:tc>
         <w:tc>
           <w:tcPr>
-            <w:tcW w:type="dxa" w:w="1787"/>
+            <w:tcW w:type="dxa" w:w="1783"/>
             <w:tcBorders>
               <w:top w:val="single" w:color="BFBFBF" w:sz="4"/>
               <w:left w:val="single" w:color="BFBFBF" w:sz="4"/>
@@ -15133,7 +15133,7 @@
         </w:trPr>
         <w:tc>
           <w:tcPr>
-            <w:tcW w:type="dxa" w:w="2608"/>
+            <w:tcW w:type="dxa" w:w="2604"/>
             <w:tcBorders>
               <w:top w:val="single" w:color="BFBFBF" w:sz="4"/>
               <w:left w:val="single" w:color="BFBFBF" w:sz="4"/>
@@ -15159,7 +15159,7 @@
         </w:tc>
         <w:tc>
           <w:tcPr>
-            <w:tcW w:type="dxa" w:w="4965"/>
+            <w:tcW w:type="dxa" w:w="4973"/>
             <w:tcBorders>
               <w:top w:val="single" w:color="BFBFBF" w:sz="4"/>
               <w:left w:val="single" w:color="BFBFBF" w:sz="4"/>
@@ -15185,7 +15185,7 @@
         </w:tc>
         <w:tc>
           <w:tcPr>
-            <w:tcW w:type="dxa" w:w="1787"/>
+            <w:tcW w:type="dxa" w:w="1783"/>
             <w:tcBorders>
               <w:top w:val="single" w:color="BFBFBF" w:sz="4"/>
               <w:left w:val="single" w:color="BFBFBF" w:sz="4"/>
@@ -15217,7 +15217,7 @@
         </w:trPr>
         <w:tc>
           <w:tcPr>
-            <w:tcW w:type="dxa" w:w="2608"/>
+            <w:tcW w:type="dxa" w:w="2604"/>
             <w:tcBorders>
               <w:top w:val="single" w:color="BFBFBF" w:sz="4"/>
               <w:left w:val="single" w:color="BFBFBF" w:sz="4"/>
@@ -15243,7 +15243,7 @@
         </w:tc>
         <w:tc>
           <w:tcPr>
-            <w:tcW w:type="dxa" w:w="4965"/>
+            <w:tcW w:type="dxa" w:w="4973"/>
             <w:tcBorders>
               <w:top w:val="single" w:color="BFBFBF" w:sz="4"/>
               <w:left w:val="single" w:color="BFBFBF" w:sz="4"/>
@@ -15269,7 +15269,7 @@
         </w:tc>
         <w:tc>
           <w:tcPr>
-            <w:tcW w:type="dxa" w:w="1787"/>
+            <w:tcW w:type="dxa" w:w="1783"/>
             <w:tcBorders>
               <w:top w:val="single" w:color="BFBFBF" w:sz="4"/>
               <w:left w:val="single" w:color="BFBFBF" w:sz="4"/>
@@ -15301,7 +15301,7 @@
         </w:trPr>
         <w:tc>
           <w:tcPr>
-            <w:tcW w:type="dxa" w:w="2608"/>
+            <w:tcW w:type="dxa" w:w="2604"/>
             <w:tcBorders>
               <w:top w:val="single" w:color="BFBFBF" w:sz="4"/>
               <w:left w:val="single" w:color="BFBFBF" w:sz="4"/>
@@ -15327,7 +15327,7 @@
         </w:tc>
         <w:tc>
           <w:tcPr>
-            <w:tcW w:type="dxa" w:w="4965"/>
+            <w:tcW w:type="dxa" w:w="4973"/>
             <w:tcBorders>
               <w:top w:val="single" w:color="BFBFBF" w:sz="4"/>
               <w:left w:val="single" w:color="BFBFBF" w:sz="4"/>
@@ -15353,7 +15353,7 @@
         </w:tc>
         <w:tc>
           <w:tcPr>
-            <w:tcW w:type="dxa" w:w="1787"/>
+            <w:tcW w:type="dxa" w:w="1783"/>
             <w:tcBorders>
               <w:top w:val="single" w:color="BFBFBF" w:sz="4"/>
               <w:left w:val="single" w:color="BFBFBF" w:sz="4"/>
@@ -15385,7 +15385,7 @@
         </w:trPr>
         <w:tc>
           <w:tcPr>
-            <w:tcW w:type="dxa" w:w="2608"/>
+            <w:tcW w:type="dxa" w:w="2604"/>
             <w:tcBorders>
               <w:top w:val="single" w:color="BFBFBF" w:sz="4"/>
               <w:left w:val="single" w:color="BFBFBF" w:sz="4"/>
@@ -15411,7 +15411,7 @@
         </w:tc>
         <w:tc>
           <w:tcPr>
-            <w:tcW w:type="dxa" w:w="4965"/>
+            <w:tcW w:type="dxa" w:w="4973"/>
             <w:tcBorders>
               <w:top w:val="single" w:color="BFBFBF" w:sz="4"/>
               <w:left w:val="single" w:color="BFBFBF" w:sz="4"/>
@@ -15437,7 +15437,7 @@
         </w:tc>
         <w:tc>
           <w:tcPr>
-            <w:tcW w:type="dxa" w:w="1787"/>
+            <w:tcW w:type="dxa" w:w="1783"/>
             <w:tcBorders>
               <w:top w:val="single" w:color="BFBFBF" w:sz="4"/>
               <w:left w:val="single" w:color="BFBFBF" w:sz="4"/>
@@ -15469,7 +15469,7 @@
         </w:trPr>
         <w:tc>
           <w:tcPr>
-            <w:tcW w:type="dxa" w:w="2608"/>
+            <w:tcW w:type="dxa" w:w="2604"/>
             <w:tcBorders>
               <w:top w:val="single" w:color="BFBFBF" w:sz="4"/>
               <w:left w:val="single" w:color="BFBFBF" w:sz="4"/>
@@ -15495,7 +15495,7 @@
         </w:tc>
         <w:tc>
           <w:tcPr>
-            <w:tcW w:type="dxa" w:w="4965"/>
+            <w:tcW w:type="dxa" w:w="4973"/>
             <w:tcBorders>
               <w:top w:val="single" w:color="BFBFBF" w:sz="4"/>
               <w:left w:val="single" w:color="BFBFBF" w:sz="4"/>
@@ -15521,7 +15521,7 @@
         </w:tc>
         <w:tc>
           <w:tcPr>
-            <w:tcW w:type="dxa" w:w="1787"/>
+            <w:tcW w:type="dxa" w:w="1783"/>
             <w:tcBorders>
               <w:top w:val="single" w:color="BFBFBF" w:sz="4"/>
               <w:left w:val="single" w:color="BFBFBF" w:sz="4"/>
@@ -15553,7 +15553,7 @@
         </w:trPr>
         <w:tc>
           <w:tcPr>
-            <w:tcW w:type="dxa" w:w="2608"/>
+            <w:tcW w:type="dxa" w:w="2604"/>
             <w:tcBorders>
               <w:top w:val="single" w:color="BFBFBF" w:sz="4"/>
               <w:left w:val="single" w:color="BFBFBF" w:sz="4"/>
@@ -15579,7 +15579,7 @@
         </w:tc>
         <w:tc>
           <w:tcPr>
-            <w:tcW w:type="dxa" w:w="4965"/>
+            <w:tcW w:type="dxa" w:w="4973"/>
             <w:tcBorders>
               <w:top w:val="single" w:color="BFBFBF" w:sz="4"/>
               <w:left w:val="single" w:color="BFBFBF" w:sz="4"/>
@@ -15605,7 +15605,7 @@
         </w:tc>
         <w:tc>
           <w:tcPr>
-            <w:tcW w:type="dxa" w:w="1787"/>
+            <w:tcW w:type="dxa" w:w="1783"/>
             <w:tcBorders>
               <w:top w:val="single" w:color="BFBFBF" w:sz="4"/>
               <w:left w:val="single" w:color="BFBFBF" w:sz="4"/>
@@ -15637,7 +15637,7 @@
         </w:trPr>
         <w:tc>
           <w:tcPr>
-            <w:tcW w:type="dxa" w:w="2608"/>
+            <w:tcW w:type="dxa" w:w="2604"/>
             <w:tcBorders>
               <w:top w:val="single" w:color="BFBFBF" w:sz="4"/>
               <w:left w:val="single" w:color="BFBFBF" w:sz="4"/>
@@ -15663,7 +15663,7 @@
         </w:tc>
         <w:tc>
           <w:tcPr>
-            <w:tcW w:type="dxa" w:w="4965"/>
+            <w:tcW w:type="dxa" w:w="4973"/>
             <w:tcBorders>
               <w:top w:val="single" w:color="BFBFBF" w:sz="4"/>
               <w:left w:val="single" w:color="BFBFBF" w:sz="4"/>
@@ -15689,7 +15689,7 @@
         </w:tc>
         <w:tc>
           <w:tcPr>
-            <w:tcW w:type="dxa" w:w="1787"/>
+            <w:tcW w:type="dxa" w:w="1783"/>
             <w:tcBorders>
               <w:top w:val="single" w:color="BFBFBF" w:sz="4"/>
               <w:left w:val="single" w:color="BFBFBF" w:sz="4"/>
@@ -15721,7 +15721,7 @@
         </w:trPr>
         <w:tc>
           <w:tcPr>
-            <w:tcW w:type="dxa" w:w="2608"/>
+            <w:tcW w:type="dxa" w:w="2604"/>
             <w:tcBorders>
               <w:top w:val="single" w:color="BFBFBF" w:sz="4"/>
               <w:left w:val="single" w:color="BFBFBF" w:sz="4"/>
@@ -15747,7 +15747,7 @@
         </w:tc>
         <w:tc>
           <w:tcPr>
-            <w:tcW w:type="dxa" w:w="4965"/>
+            <w:tcW w:type="dxa" w:w="4973"/>
             <w:tcBorders>
               <w:top w:val="single" w:color="BFBFBF" w:sz="4"/>
               <w:left w:val="single" w:color="BFBFBF" w:sz="4"/>
@@ -15773,7 +15773,7 @@
         </w:tc>
         <w:tc>
           <w:tcPr>
-            <w:tcW w:type="dxa" w:w="1787"/>
+            <w:tcW w:type="dxa" w:w="1783"/>
             <w:tcBorders>
               <w:top w:val="single" w:color="BFBFBF" w:sz="4"/>
               <w:left w:val="single" w:color="BFBFBF" w:sz="4"/>
@@ -15805,7 +15805,7 @@
         </w:trPr>
         <w:tc>
           <w:tcPr>
-            <w:tcW w:type="dxa" w:w="2608"/>
+            <w:tcW w:type="dxa" w:w="2604"/>
             <w:tcBorders>
               <w:top w:val="single" w:color="BFBFBF" w:sz="4"/>
               <w:left w:val="single" w:color="BFBFBF" w:sz="4"/>
@@ -15831,7 +15831,7 @@
         </w:tc>
         <w:tc>
           <w:tcPr>
-            <w:tcW w:type="dxa" w:w="4965"/>
+            <w:tcW w:type="dxa" w:w="4973"/>
             <w:tcBorders>
               <w:top w:val="single" w:color="BFBFBF" w:sz="4"/>
               <w:left w:val="single" w:color="BFBFBF" w:sz="4"/>
@@ -15857,7 +15857,7 @@
         </w:tc>
         <w:tc>
           <w:tcPr>
-            <w:tcW w:type="dxa" w:w="1787"/>
+            <w:tcW w:type="dxa" w:w="1783"/>
             <w:tcBorders>
               <w:top w:val="single" w:color="BFBFBF" w:sz="4"/>
               <w:left w:val="single" w:color="BFBFBF" w:sz="4"/>
@@ -15889,7 +15889,7 @@
         </w:trPr>
         <w:tc>
           <w:tcPr>
-            <w:tcW w:type="dxa" w:w="2608"/>
+            <w:tcW w:type="dxa" w:w="2604"/>
             <w:tcBorders>
               <w:top w:val="single" w:color="BFBFBF" w:sz="4"/>
               <w:left w:val="single" w:color="BFBFBF" w:sz="4"/>
@@ -15915,7 +15915,7 @@
         </w:tc>
         <w:tc>
           <w:tcPr>
-            <w:tcW w:type="dxa" w:w="4965"/>
+            <w:tcW w:type="dxa" w:w="4973"/>
             <w:tcBorders>
               <w:top w:val="single" w:color="BFBFBF" w:sz="4"/>
               <w:left w:val="single" w:color="BFBFBF" w:sz="4"/>
@@ -15941,7 +15941,7 @@
         </w:tc>
         <w:tc>
           <w:tcPr>
-            <w:tcW w:type="dxa" w:w="1787"/>
+            <w:tcW w:type="dxa" w:w="1783"/>
             <w:tcBorders>
               <w:top w:val="single" w:color="BFBFBF" w:sz="4"/>
               <w:left w:val="single" w:color="BFBFBF" w:sz="4"/>
@@ -15973,7 +15973,7 @@
         </w:trPr>
         <w:tc>
           <w:tcPr>
-            <w:tcW w:type="dxa" w:w="2608"/>
+            <w:tcW w:type="dxa" w:w="2604"/>
             <w:tcBorders>
               <w:top w:val="single" w:color="BFBFBF" w:sz="4"/>
               <w:left w:val="single" w:color="BFBFBF" w:sz="4"/>
@@ -15999,7 +15999,7 @@
         </w:tc>
         <w:tc>
           <w:tcPr>
-            <w:tcW w:type="dxa" w:w="4965"/>
+            <w:tcW w:type="dxa" w:w="4973"/>
             <w:tcBorders>
               <w:top w:val="single" w:color="BFBFBF" w:sz="4"/>
               <w:left w:val="single" w:color="BFBFBF" w:sz="4"/>
@@ -16025,7 +16025,7 @@
         </w:tc>
         <w:tc>
           <w:tcPr>
-            <w:tcW w:type="dxa" w:w="1787"/>
+            <w:tcW w:type="dxa" w:w="1783"/>
             <w:tcBorders>
               <w:top w:val="single" w:color="BFBFBF" w:sz="4"/>
               <w:left w:val="single" w:color="BFBFBF" w:sz="4"/>
@@ -16057,7 +16057,7 @@
         </w:trPr>
         <w:tc>
           <w:tcPr>
-            <w:tcW w:type="dxa" w:w="2608"/>
+            <w:tcW w:type="dxa" w:w="2604"/>
             <w:tcBorders>
               <w:top w:val="single" w:color="BFBFBF" w:sz="4"/>
               <w:left w:val="single" w:color="BFBFBF" w:sz="4"/>
@@ -16083,7 +16083,7 @@
         </w:tc>
         <w:tc>
           <w:tcPr>
-            <w:tcW w:type="dxa" w:w="4965"/>
+            <w:tcW w:type="dxa" w:w="4973"/>
             <w:tcBorders>
               <w:top w:val="single" w:color="BFBFBF" w:sz="4"/>
               <w:left w:val="single" w:color="BFBFBF" w:sz="4"/>
@@ -16109,7 +16109,7 @@
         </w:tc>
         <w:tc>
           <w:tcPr>
-            <w:tcW w:type="dxa" w:w="1787"/>
+            <w:tcW w:type="dxa" w:w="1783"/>
             <w:tcBorders>
               <w:top w:val="single" w:color="BFBFBF" w:sz="4"/>
               <w:left w:val="single" w:color="BFBFBF" w:sz="4"/>
@@ -16141,7 +16141,7 @@
         </w:trPr>
         <w:tc>
           <w:tcPr>
-            <w:tcW w:type="dxa" w:w="2608"/>
+            <w:tcW w:type="dxa" w:w="2604"/>
             <w:tcBorders>
               <w:top w:val="single" w:color="BFBFBF" w:sz="4"/>
               <w:left w:val="single" w:color="BFBFBF" w:sz="4"/>
@@ -16167,7 +16167,7 @@
         </w:tc>
         <w:tc>
           <w:tcPr>
-            <w:tcW w:type="dxa" w:w="4965"/>
+            <w:tcW w:type="dxa" w:w="4973"/>
             <w:tcBorders>
               <w:top w:val="single" w:color="BFBFBF" w:sz="4"/>
               <w:left w:val="single" w:color="BFBFBF" w:sz="4"/>
@@ -16193,7 +16193,7 @@
         </w:tc>
         <w:tc>
           <w:tcPr>
-            <w:tcW w:type="dxa" w:w="1787"/>
+            <w:tcW w:type="dxa" w:w="1783"/>
             <w:tcBorders>
               <w:top w:val="single" w:color="BFBFBF" w:sz="4"/>
               <w:left w:val="single" w:color="BFBFBF" w:sz="4"/>
@@ -16225,7 +16225,7 @@
         </w:trPr>
         <w:tc>
           <w:tcPr>
-            <w:tcW w:type="dxa" w:w="2608"/>
+            <w:tcW w:type="dxa" w:w="2604"/>
             <w:tcBorders>
               <w:top w:val="single" w:color="BFBFBF" w:sz="4"/>
               <w:left w:val="single" w:color="BFBFBF" w:sz="4"/>
@@ -16251,7 +16251,7 @@
         </w:tc>
         <w:tc>
           <w:tcPr>
-            <w:tcW w:type="dxa" w:w="4965"/>
+            <w:tcW w:type="dxa" w:w="4973"/>
             <w:tcBorders>
               <w:top w:val="single" w:color="BFBFBF" w:sz="4"/>
               <w:left w:val="single" w:color="BFBFBF" w:sz="4"/>
@@ -16277,7 +16277,7 @@
         </w:tc>
         <w:tc>
           <w:tcPr>
-            <w:tcW w:type="dxa" w:w="1787"/>
+            <w:tcW w:type="dxa" w:w="1783"/>
             <w:tcBorders>
               <w:top w:val="single" w:color="BFBFBF" w:sz="4"/>
               <w:left w:val="single" w:color="BFBFBF" w:sz="4"/>
@@ -16309,7 +16309,7 @@
         </w:trPr>
         <w:tc>
           <w:tcPr>
-            <w:tcW w:type="dxa" w:w="2608"/>
+            <w:tcW w:type="dxa" w:w="2604"/>
             <w:tcBorders>
               <w:top w:val="single" w:color="BFBFBF" w:sz="4"/>
               <w:left w:val="single" w:color="BFBFBF" w:sz="4"/>
@@ -16335,7 +16335,7 @@
         </w:tc>
         <w:tc>
           <w:tcPr>
-            <w:tcW w:type="dxa" w:w="4965"/>
+            <w:tcW w:type="dxa" w:w="4973"/>
             <w:tcBorders>
               <w:top w:val="single" w:color="BFBFBF" w:sz="4"/>
               <w:left w:val="single" w:color="BFBFBF" w:sz="4"/>
@@ -16361,7 +16361,7 @@
         </w:tc>
         <w:tc>
           <w:tcPr>
-            <w:tcW w:type="dxa" w:w="1787"/>
+            <w:tcW w:type="dxa" w:w="1783"/>
             <w:tcBorders>
               <w:top w:val="single" w:color="BFBFBF" w:sz="4"/>
               <w:left w:val="single" w:color="BFBFBF" w:sz="4"/>
@@ -16393,59 +16393,59 @@
         </w:trPr>
         <w:tc>
           <w:tcPr>
-            <w:tcW w:type="dxa" w:w="2608"/>
-            <w:tcBorders>
-              <w:top w:val="single" w:color="BFBFBF" w:sz="4"/>
-              <w:left w:val="single" w:color="BFBFBF" w:sz="4"/>
-              <w:bottom w:val="single" w:color="BFBFBF" w:sz="4"/>
-              <w:right w:val="single" w:color="BFBFBF" w:sz="4"/>
-            </w:tcBorders>
-            <w:tcMar>
-              <w:top w:type="dxa" w:w="60"/>
-              <w:left w:type="dxa" w:w="100"/>
-              <w:bottom w:type="dxa" w:w="60"/>
-              <w:right w:type="dxa" w:w="100"/>
-            </w:tcMar>
-          </w:tcPr>
-          <w:p>
-            <w:r>
-              <w:rPr>
-                <w:sz w:val="20"/>
-                <w:szCs w:val="20"/>
-              </w:rPr>
-              <w:t xml:space="preserve">Cost currency</w:t>
-            </w:r>
-          </w:p>
-        </w:tc>
-        <w:tc>
-          <w:tcPr>
-            <w:tcW w:type="dxa" w:w="4965"/>
-            <w:tcBorders>
-              <w:top w:val="single" w:color="BFBFBF" w:sz="4"/>
-              <w:left w:val="single" w:color="BFBFBF" w:sz="4"/>
-              <w:bottom w:val="single" w:color="BFBFBF" w:sz="4"/>
-              <w:right w:val="single" w:color="BFBFBF" w:sz="4"/>
-            </w:tcBorders>
-            <w:tcMar>
-              <w:top w:type="dxa" w:w="60"/>
-              <w:left w:type="dxa" w:w="100"/>
-              <w:bottom w:type="dxa" w:w="60"/>
-              <w:right w:type="dxa" w:w="100"/>
-            </w:tcMar>
-          </w:tcPr>
-          <w:p>
-            <w:r>
-              <w:rPr>
-                <w:sz w:val="20"/>
-                <w:szCs w:val="20"/>
-              </w:rPr>
-              <w:t xml:space="preserve">Every cost recorded in both US dollars and Indian rupees</w:t>
-            </w:r>
-          </w:p>
-        </w:tc>
-        <w:tc>
-          <w:tcPr>
-            <w:tcW w:type="dxa" w:w="1787"/>
+            <w:tcW w:type="dxa" w:w="2604"/>
+            <w:tcBorders>
+              <w:top w:val="single" w:color="BFBFBF" w:sz="4"/>
+              <w:left w:val="single" w:color="BFBFBF" w:sz="4"/>
+              <w:bottom w:val="single" w:color="BFBFBF" w:sz="4"/>
+              <w:right w:val="single" w:color="BFBFBF" w:sz="4"/>
+            </w:tcBorders>
+            <w:tcMar>
+              <w:top w:type="dxa" w:w="60"/>
+              <w:left w:type="dxa" w:w="100"/>
+              <w:bottom w:type="dxa" w:w="60"/>
+              <w:right w:type="dxa" w:w="100"/>
+            </w:tcMar>
+          </w:tcPr>
+          <w:p>
+            <w:r>
+              <w:rPr>
+                <w:sz w:val="20"/>
+                <w:szCs w:val="20"/>
+              </w:rPr>
+              <w:t xml:space="preserve">Tech stack version 2</w:t>
+            </w:r>
+          </w:p>
+        </w:tc>
+        <w:tc>
+          <w:tcPr>
+            <w:tcW w:type="dxa" w:w="4973"/>
+            <w:tcBorders>
+              <w:top w:val="single" w:color="BFBFBF" w:sz="4"/>
+              <w:left w:val="single" w:color="BFBFBF" w:sz="4"/>
+              <w:bottom w:val="single" w:color="BFBFBF" w:sz="4"/>
+              <w:right w:val="single" w:color="BFBFBF" w:sz="4"/>
+            </w:tcBorders>
+            <w:tcMar>
+              <w:top w:type="dxa" w:w="60"/>
+              <w:left w:type="dxa" w:w="100"/>
+              <w:bottom w:type="dxa" w:w="60"/>
+              <w:right w:type="dxa" w:w="100"/>
+            </w:tcMar>
+          </w:tcPr>
+          <w:p>
+            <w:r>
+              <w:rPr>
+                <w:sz w:val="20"/>
+                <w:szCs w:val="20"/>
+              </w:rPr>
+              <w:t xml:space="preserve">Approved: ESLint 10.10.0 in place of the unsupported 9.39.5</w:t>
+            </w:r>
+          </w:p>
+        </w:tc>
+        <w:tc>
+          <w:tcPr>
+            <w:tcW w:type="dxa" w:w="1783"/>
             <w:tcBorders>
               <w:top w:val="single" w:color="BFBFBF" w:sz="4"/>
               <w:left w:val="single" w:color="BFBFBF" w:sz="4"/>
@@ -16477,59 +16477,59 @@
         </w:trPr>
         <w:tc>
           <w:tcPr>
-            <w:tcW w:type="dxa" w:w="2608"/>
-            <w:tcBorders>
-              <w:top w:val="single" w:color="BFBFBF" w:sz="4"/>
-              <w:left w:val="single" w:color="BFBFBF" w:sz="4"/>
-              <w:bottom w:val="single" w:color="BFBFBF" w:sz="4"/>
-              <w:right w:val="single" w:color="BFBFBF" w:sz="4"/>
-            </w:tcBorders>
-            <w:tcMar>
-              <w:top w:type="dxa" w:w="60"/>
-              <w:left w:type="dxa" w:w="100"/>
-              <w:bottom w:type="dxa" w:w="60"/>
-              <w:right w:type="dxa" w:w="100"/>
-            </w:tcMar>
-          </w:tcPr>
-          <w:p>
-            <w:r>
-              <w:rPr>
-                <w:sz w:val="20"/>
-                <w:szCs w:val="20"/>
-              </w:rPr>
-              <w:t xml:space="preserve">Retention of job inputs and notifications</w:t>
-            </w:r>
-          </w:p>
-        </w:tc>
-        <w:tc>
-          <w:tcPr>
-            <w:tcW w:type="dxa" w:w="4965"/>
-            <w:tcBorders>
-              <w:top w:val="single" w:color="BFBFBF" w:sz="4"/>
-              <w:left w:val="single" w:color="BFBFBF" w:sz="4"/>
-              <w:bottom w:val="single" w:color="BFBFBF" w:sz="4"/>
-              <w:right w:val="single" w:color="BFBFBF" w:sz="4"/>
-            </w:tcBorders>
-            <w:tcMar>
-              <w:top w:type="dxa" w:w="60"/>
-              <w:left w:type="dxa" w:w="100"/>
-              <w:bottom w:type="dxa" w:w="60"/>
-              <w:right w:type="dxa" w:w="100"/>
-            </w:tcMar>
-          </w:tcPr>
-          <w:p>
-            <w:r>
-              <w:rPr>
-                <w:sz w:val="20"/>
-                <w:szCs w:val="20"/>
-              </w:rPr>
-              <w:t xml:space="preserve">90 days</w:t>
-            </w:r>
-          </w:p>
-        </w:tc>
-        <w:tc>
-          <w:tcPr>
-            <w:tcW w:type="dxa" w:w="1787"/>
+            <w:tcW w:type="dxa" w:w="2604"/>
+            <w:tcBorders>
+              <w:top w:val="single" w:color="BFBFBF" w:sz="4"/>
+              <w:left w:val="single" w:color="BFBFBF" w:sz="4"/>
+              <w:bottom w:val="single" w:color="BFBFBF" w:sz="4"/>
+              <w:right w:val="single" w:color="BFBFBF" w:sz="4"/>
+            </w:tcBorders>
+            <w:tcMar>
+              <w:top w:type="dxa" w:w="60"/>
+              <w:left w:type="dxa" w:w="100"/>
+              <w:bottom w:type="dxa" w:w="60"/>
+              <w:right w:type="dxa" w:w="100"/>
+            </w:tcMar>
+          </w:tcPr>
+          <w:p>
+            <w:r>
+              <w:rPr>
+                <w:sz w:val="20"/>
+                <w:szCs w:val="20"/>
+              </w:rPr>
+              <w:t xml:space="preserve">Cost currency</w:t>
+            </w:r>
+          </w:p>
+        </w:tc>
+        <w:tc>
+          <w:tcPr>
+            <w:tcW w:type="dxa" w:w="4973"/>
+            <w:tcBorders>
+              <w:top w:val="single" w:color="BFBFBF" w:sz="4"/>
+              <w:left w:val="single" w:color="BFBFBF" w:sz="4"/>
+              <w:bottom w:val="single" w:color="BFBFBF" w:sz="4"/>
+              <w:right w:val="single" w:color="BFBFBF" w:sz="4"/>
+            </w:tcBorders>
+            <w:tcMar>
+              <w:top w:type="dxa" w:w="60"/>
+              <w:left w:type="dxa" w:w="100"/>
+              <w:bottom w:type="dxa" w:w="60"/>
+              <w:right w:type="dxa" w:w="100"/>
+            </w:tcMar>
+          </w:tcPr>
+          <w:p>
+            <w:r>
+              <w:rPr>
+                <w:sz w:val="20"/>
+                <w:szCs w:val="20"/>
+              </w:rPr>
+              <w:t xml:space="preserve">Every cost recorded in both US dollars and Indian rupees</w:t>
+            </w:r>
+          </w:p>
+        </w:tc>
+        <w:tc>
+          <w:tcPr>
+            <w:tcW w:type="dxa" w:w="1783"/>
             <w:tcBorders>
               <w:top w:val="single" w:color="BFBFBF" w:sz="4"/>
               <w:left w:val="single" w:color="BFBFBF" w:sz="4"/>
@@ -16561,59 +16561,59 @@
         </w:trPr>
         <w:tc>
           <w:tcPr>
-            <w:tcW w:type="dxa" w:w="2608"/>
-            <w:tcBorders>
-              <w:top w:val="single" w:color="BFBFBF" w:sz="4"/>
-              <w:left w:val="single" w:color="BFBFBF" w:sz="4"/>
-              <w:bottom w:val="single" w:color="BFBFBF" w:sz="4"/>
-              <w:right w:val="single" w:color="BFBFBF" w:sz="4"/>
-            </w:tcBorders>
-            <w:tcMar>
-              <w:top w:type="dxa" w:w="60"/>
-              <w:left w:type="dxa" w:w="100"/>
-              <w:bottom w:type="dxa" w:w="60"/>
-              <w:right w:type="dxa" w:w="100"/>
-            </w:tcMar>
-          </w:tcPr>
-          <w:p>
-            <w:r>
-              <w:rPr>
-                <w:sz w:val="20"/>
-                <w:szCs w:val="20"/>
-              </w:rPr>
-              <w:t xml:space="preserve">Database schema version 2</w:t>
-            </w:r>
-          </w:p>
-        </w:tc>
-        <w:tc>
-          <w:tcPr>
-            <w:tcW w:type="dxa" w:w="4965"/>
-            <w:tcBorders>
-              <w:top w:val="single" w:color="BFBFBF" w:sz="4"/>
-              <w:left w:val="single" w:color="BFBFBF" w:sz="4"/>
-              <w:bottom w:val="single" w:color="BFBFBF" w:sz="4"/>
-              <w:right w:val="single" w:color="BFBFBF" w:sz="4"/>
-            </w:tcBorders>
-            <w:tcMar>
-              <w:top w:type="dxa" w:w="60"/>
-              <w:left w:type="dxa" w:w="100"/>
-              <w:bottom w:type="dxa" w:w="60"/>
-              <w:right w:type="dxa" w:w="100"/>
-            </w:tcMar>
-          </w:tcPr>
-          <w:p>
-            <w:r>
-              <w:rPr>
-                <w:sz w:val="20"/>
-                <w:szCs w:val="20"/>
-              </w:rPr>
-              <w:t xml:space="preserve">Approved. Later-phase tables stay provisional.</w:t>
-            </w:r>
-          </w:p>
-        </w:tc>
-        <w:tc>
-          <w:tcPr>
-            <w:tcW w:type="dxa" w:w="1787"/>
+            <w:tcW w:type="dxa" w:w="2604"/>
+            <w:tcBorders>
+              <w:top w:val="single" w:color="BFBFBF" w:sz="4"/>
+              <w:left w:val="single" w:color="BFBFBF" w:sz="4"/>
+              <w:bottom w:val="single" w:color="BFBFBF" w:sz="4"/>
+              <w:right w:val="single" w:color="BFBFBF" w:sz="4"/>
+            </w:tcBorders>
+            <w:tcMar>
+              <w:top w:type="dxa" w:w="60"/>
+              <w:left w:type="dxa" w:w="100"/>
+              <w:bottom w:type="dxa" w:w="60"/>
+              <w:right w:type="dxa" w:w="100"/>
+            </w:tcMar>
+          </w:tcPr>
+          <w:p>
+            <w:r>
+              <w:rPr>
+                <w:sz w:val="20"/>
+                <w:szCs w:val="20"/>
+              </w:rPr>
+              <w:t xml:space="preserve">Retention of job inputs and notifications</w:t>
+            </w:r>
+          </w:p>
+        </w:tc>
+        <w:tc>
+          <w:tcPr>
+            <w:tcW w:type="dxa" w:w="4973"/>
+            <w:tcBorders>
+              <w:top w:val="single" w:color="BFBFBF" w:sz="4"/>
+              <w:left w:val="single" w:color="BFBFBF" w:sz="4"/>
+              <w:bottom w:val="single" w:color="BFBFBF" w:sz="4"/>
+              <w:right w:val="single" w:color="BFBFBF" w:sz="4"/>
+            </w:tcBorders>
+            <w:tcMar>
+              <w:top w:type="dxa" w:w="60"/>
+              <w:left w:type="dxa" w:w="100"/>
+              <w:bottom w:type="dxa" w:w="60"/>
+              <w:right w:type="dxa" w:w="100"/>
+            </w:tcMar>
+          </w:tcPr>
+          <w:p>
+            <w:r>
+              <w:rPr>
+                <w:sz w:val="20"/>
+                <w:szCs w:val="20"/>
+              </w:rPr>
+              <w:t xml:space="preserve">90 days</w:t>
+            </w:r>
+          </w:p>
+        </w:tc>
+        <w:tc>
+          <w:tcPr>
+            <w:tcW w:type="dxa" w:w="1783"/>
             <w:tcBorders>
               <w:top w:val="single" w:color="BFBFBF" w:sz="4"/>
               <w:left w:val="single" w:color="BFBFBF" w:sz="4"/>
@@ -16645,59 +16645,59 @@
         </w:trPr>
         <w:tc>
           <w:tcPr>
-            <w:tcW w:type="dxa" w:w="2608"/>
-            <w:tcBorders>
-              <w:top w:val="single" w:color="BFBFBF" w:sz="4"/>
-              <w:left w:val="single" w:color="BFBFBF" w:sz="4"/>
-              <w:bottom w:val="single" w:color="BFBFBF" w:sz="4"/>
-              <w:right w:val="single" w:color="BFBFBF" w:sz="4"/>
-            </w:tcBorders>
-            <w:tcMar>
-              <w:top w:type="dxa" w:w="60"/>
-              <w:left w:type="dxa" w:w="100"/>
-              <w:bottom w:type="dxa" w:w="60"/>
-              <w:right w:type="dxa" w:w="100"/>
-            </w:tcMar>
-          </w:tcPr>
-          <w:p>
-            <w:r>
-              <w:rPr>
-                <w:sz w:val="20"/>
-                <w:szCs w:val="20"/>
-              </w:rPr>
-              <w:t xml:space="preserve">Phased implementation plan version 1</w:t>
-            </w:r>
-          </w:p>
-        </w:tc>
-        <w:tc>
-          <w:tcPr>
-            <w:tcW w:type="dxa" w:w="4965"/>
-            <w:tcBorders>
-              <w:top w:val="single" w:color="BFBFBF" w:sz="4"/>
-              <w:left w:val="single" w:color="BFBFBF" w:sz="4"/>
-              <w:bottom w:val="single" w:color="BFBFBF" w:sz="4"/>
-              <w:right w:val="single" w:color="BFBFBF" w:sz="4"/>
-            </w:tcBorders>
-            <w:tcMar>
-              <w:top w:type="dxa" w:w="60"/>
-              <w:left w:type="dxa" w:w="100"/>
-              <w:bottom w:type="dxa" w:w="60"/>
-              <w:right w:type="dxa" w:w="100"/>
-            </w:tcMar>
-          </w:tcPr>
-          <w:p>
-            <w:r>
-              <w:rPr>
-                <w:sz w:val="20"/>
-                <w:szCs w:val="20"/>
-              </w:rPr>
-              <w:t xml:space="preserve">Approved, with its assumption that Claude Code builds and the owner reviews</w:t>
-            </w:r>
-          </w:p>
-        </w:tc>
-        <w:tc>
-          <w:tcPr>
-            <w:tcW w:type="dxa" w:w="1787"/>
+            <w:tcW w:type="dxa" w:w="2604"/>
+            <w:tcBorders>
+              <w:top w:val="single" w:color="BFBFBF" w:sz="4"/>
+              <w:left w:val="single" w:color="BFBFBF" w:sz="4"/>
+              <w:bottom w:val="single" w:color="BFBFBF" w:sz="4"/>
+              <w:right w:val="single" w:color="BFBFBF" w:sz="4"/>
+            </w:tcBorders>
+            <w:tcMar>
+              <w:top w:type="dxa" w:w="60"/>
+              <w:left w:type="dxa" w:w="100"/>
+              <w:bottom w:type="dxa" w:w="60"/>
+              <w:right w:type="dxa" w:w="100"/>
+            </w:tcMar>
+          </w:tcPr>
+          <w:p>
+            <w:r>
+              <w:rPr>
+                <w:sz w:val="20"/>
+                <w:szCs w:val="20"/>
+              </w:rPr>
+              <w:t xml:space="preserve">Database schema version 2</w:t>
+            </w:r>
+          </w:p>
+        </w:tc>
+        <w:tc>
+          <w:tcPr>
+            <w:tcW w:type="dxa" w:w="4973"/>
+            <w:tcBorders>
+              <w:top w:val="single" w:color="BFBFBF" w:sz="4"/>
+              <w:left w:val="single" w:color="BFBFBF" w:sz="4"/>
+              <w:bottom w:val="single" w:color="BFBFBF" w:sz="4"/>
+              <w:right w:val="single" w:color="BFBFBF" w:sz="4"/>
+            </w:tcBorders>
+            <w:tcMar>
+              <w:top w:type="dxa" w:w="60"/>
+              <w:left w:type="dxa" w:w="100"/>
+              <w:bottom w:type="dxa" w:w="60"/>
+              <w:right w:type="dxa" w:w="100"/>
+            </w:tcMar>
+          </w:tcPr>
+          <w:p>
+            <w:r>
+              <w:rPr>
+                <w:sz w:val="20"/>
+                <w:szCs w:val="20"/>
+              </w:rPr>
+              <w:t xml:space="preserve">Approved. Later-phase tables stay provisional.</w:t>
+            </w:r>
+          </w:p>
+        </w:tc>
+        <w:tc>
+          <w:tcPr>
+            <w:tcW w:type="dxa" w:w="1783"/>
             <w:tcBorders>
               <w:top w:val="single" w:color="BFBFBF" w:sz="4"/>
               <w:left w:val="single" w:color="BFBFBF" w:sz="4"/>
@@ -16729,59 +16729,59 @@
         </w:trPr>
         <w:tc>
           <w:tcPr>
-            <w:tcW w:type="dxa" w:w="2608"/>
-            <w:tcBorders>
-              <w:top w:val="single" w:color="BFBFBF" w:sz="4"/>
-              <w:left w:val="single" w:color="BFBFBF" w:sz="4"/>
-              <w:bottom w:val="single" w:color="BFBFBF" w:sz="4"/>
-              <w:right w:val="single" w:color="BFBFBF" w:sz="4"/>
-            </w:tcBorders>
-            <w:tcMar>
-              <w:top w:type="dxa" w:w="60"/>
-              <w:left w:type="dxa" w:w="100"/>
-              <w:bottom w:type="dxa" w:w="60"/>
-              <w:right w:type="dxa" w:w="100"/>
-            </w:tcMar>
-          </w:tcPr>
-          <w:p>
-            <w:r>
-              <w:rPr>
-                <w:sz w:val="20"/>
-                <w:szCs w:val="20"/>
-              </w:rPr>
-              <w:t xml:space="preserve">Permission to commit (A8)</w:t>
-            </w:r>
-          </w:p>
-        </w:tc>
-        <w:tc>
-          <w:tcPr>
-            <w:tcW w:type="dxa" w:w="4965"/>
-            <w:tcBorders>
-              <w:top w:val="single" w:color="BFBFBF" w:sz="4"/>
-              <w:left w:val="single" w:color="BFBFBF" w:sz="4"/>
-              <w:bottom w:val="single" w:color="BFBFBF" w:sz="4"/>
-              <w:right w:val="single" w:color="BFBFBF" w:sz="4"/>
-            </w:tcBorders>
-            <w:tcMar>
-              <w:top w:type="dxa" w:w="60"/>
-              <w:left w:type="dxa" w:w="100"/>
-              <w:bottom w:type="dxa" w:w="60"/>
-              <w:right w:type="dxa" w:w="100"/>
-            </w:tcMar>
-          </w:tcPr>
-          <w:p>
-            <w:r>
-              <w:rPr>
-                <w:sz w:val="20"/>
-                <w:szCs w:val="20"/>
-              </w:rPr>
-              <w:t xml:space="preserve">Yes</w:t>
-            </w:r>
-          </w:p>
-        </w:tc>
-        <w:tc>
-          <w:tcPr>
-            <w:tcW w:type="dxa" w:w="1787"/>
+            <w:tcW w:type="dxa" w:w="2604"/>
+            <w:tcBorders>
+              <w:top w:val="single" w:color="BFBFBF" w:sz="4"/>
+              <w:left w:val="single" w:color="BFBFBF" w:sz="4"/>
+              <w:bottom w:val="single" w:color="BFBFBF" w:sz="4"/>
+              <w:right w:val="single" w:color="BFBFBF" w:sz="4"/>
+            </w:tcBorders>
+            <w:tcMar>
+              <w:top w:type="dxa" w:w="60"/>
+              <w:left w:type="dxa" w:w="100"/>
+              <w:bottom w:type="dxa" w:w="60"/>
+              <w:right w:type="dxa" w:w="100"/>
+            </w:tcMar>
+          </w:tcPr>
+          <w:p>
+            <w:r>
+              <w:rPr>
+                <w:sz w:val="20"/>
+                <w:szCs w:val="20"/>
+              </w:rPr>
+              <w:t xml:space="preserve">Phased implementation plan version 1</w:t>
+            </w:r>
+          </w:p>
+        </w:tc>
+        <w:tc>
+          <w:tcPr>
+            <w:tcW w:type="dxa" w:w="4973"/>
+            <w:tcBorders>
+              <w:top w:val="single" w:color="BFBFBF" w:sz="4"/>
+              <w:left w:val="single" w:color="BFBFBF" w:sz="4"/>
+              <w:bottom w:val="single" w:color="BFBFBF" w:sz="4"/>
+              <w:right w:val="single" w:color="BFBFBF" w:sz="4"/>
+            </w:tcBorders>
+            <w:tcMar>
+              <w:top w:type="dxa" w:w="60"/>
+              <w:left w:type="dxa" w:w="100"/>
+              <w:bottom w:type="dxa" w:w="60"/>
+              <w:right w:type="dxa" w:w="100"/>
+            </w:tcMar>
+          </w:tcPr>
+          <w:p>
+            <w:r>
+              <w:rPr>
+                <w:sz w:val="20"/>
+                <w:szCs w:val="20"/>
+              </w:rPr>
+              <w:t xml:space="preserve">Approved, with its assumption that Claude Code builds and the owner reviews</w:t>
+            </w:r>
+          </w:p>
+        </w:tc>
+        <w:tc>
+          <w:tcPr>
+            <w:tcW w:type="dxa" w:w="1783"/>
             <w:tcBorders>
               <w:top w:val="single" w:color="BFBFBF" w:sz="4"/>
               <w:left w:val="single" w:color="BFBFBF" w:sz="4"/>
@@ -16813,7 +16813,91 @@
         </w:trPr>
         <w:tc>
           <w:tcPr>
-            <w:tcW w:type="dxa" w:w="2608"/>
+            <w:tcW w:type="dxa" w:w="2604"/>
+            <w:tcBorders>
+              <w:top w:val="single" w:color="BFBFBF" w:sz="4"/>
+              <w:left w:val="single" w:color="BFBFBF" w:sz="4"/>
+              <w:bottom w:val="single" w:color="BFBFBF" w:sz="4"/>
+              <w:right w:val="single" w:color="BFBFBF" w:sz="4"/>
+            </w:tcBorders>
+            <w:tcMar>
+              <w:top w:type="dxa" w:w="60"/>
+              <w:left w:type="dxa" w:w="100"/>
+              <w:bottom w:type="dxa" w:w="60"/>
+              <w:right w:type="dxa" w:w="100"/>
+            </w:tcMar>
+          </w:tcPr>
+          <w:p>
+            <w:r>
+              <w:rPr>
+                <w:sz w:val="20"/>
+                <w:szCs w:val="20"/>
+              </w:rPr>
+              <w:t xml:space="preserve">Permission to commit (A8)</w:t>
+            </w:r>
+          </w:p>
+        </w:tc>
+        <w:tc>
+          <w:tcPr>
+            <w:tcW w:type="dxa" w:w="4973"/>
+            <w:tcBorders>
+              <w:top w:val="single" w:color="BFBFBF" w:sz="4"/>
+              <w:left w:val="single" w:color="BFBFBF" w:sz="4"/>
+              <w:bottom w:val="single" w:color="BFBFBF" w:sz="4"/>
+              <w:right w:val="single" w:color="BFBFBF" w:sz="4"/>
+            </w:tcBorders>
+            <w:tcMar>
+              <w:top w:type="dxa" w:w="60"/>
+              <w:left w:type="dxa" w:w="100"/>
+              <w:bottom w:type="dxa" w:w="60"/>
+              <w:right w:type="dxa" w:w="100"/>
+            </w:tcMar>
+          </w:tcPr>
+          <w:p>
+            <w:r>
+              <w:rPr>
+                <w:sz w:val="20"/>
+                <w:szCs w:val="20"/>
+              </w:rPr>
+              <w:t xml:space="preserve">Yes</w:t>
+            </w:r>
+          </w:p>
+        </w:tc>
+        <w:tc>
+          <w:tcPr>
+            <w:tcW w:type="dxa" w:w="1783"/>
+            <w:tcBorders>
+              <w:top w:val="single" w:color="BFBFBF" w:sz="4"/>
+              <w:left w:val="single" w:color="BFBFBF" w:sz="4"/>
+              <w:bottom w:val="single" w:color="BFBFBF" w:sz="4"/>
+              <w:right w:val="single" w:color="BFBFBF" w:sz="4"/>
+            </w:tcBorders>
+            <w:tcMar>
+              <w:top w:type="dxa" w:w="60"/>
+              <w:left w:type="dxa" w:w="100"/>
+              <w:bottom w:type="dxa" w:w="60"/>
+              <w:right w:type="dxa" w:w="100"/>
+            </w:tcMar>
+          </w:tcPr>
+          <w:p>
+            <w:r>
+              <w:rPr>
+                <w:sz w:val="20"/>
+                <w:szCs w:val="20"/>
+              </w:rPr>
+              <w:t xml:space="preserve">2026-10-04</w:t>
+            </w:r>
+          </w:p>
+        </w:tc>
+      </w:tr>
+      <w:tr>
+        <w:trPr>
+          <w:cantSplit/>
+          <w:tblHeader w:val="off"/>
+        </w:trPr>
+        <w:tc>
+          <w:tcPr>
+            <w:tcW w:type="dxa" w:w="2604"/>
             <w:tcBorders>
               <w:top w:val="single" w:color="BFBFBF" w:sz="4"/>
               <w:left w:val="single" w:color="BFBFBF" w:sz="4"/>
@@ -16839,7 +16923,7 @@
         </w:tc>
         <w:tc>
           <w:tcPr>
-            <w:tcW w:type="dxa" w:w="4965"/>
+            <w:tcW w:type="dxa" w:w="4973"/>
             <w:tcBorders>
               <w:top w:val="single" w:color="BFBFBF" w:sz="4"/>
               <w:left w:val="single" w:color="BFBFBF" w:sz="4"/>
@@ -16874,7 +16958,7 @@
         </w:tc>
         <w:tc>
           <w:tcPr>
-            <w:tcW w:type="dxa" w:w="1787"/>
+            <w:tcW w:type="dxa" w:w="1783"/>
             <w:tcBorders>
               <w:top w:val="single" w:color="BFBFBF" w:sz="4"/>
               <w:left w:val="single" w:color="BFBFBF" w:sz="4"/>

</xml_diff>